<commit_message>
Strengthened payment terms in Master Agreement
</commit_message>
<xml_diff>
--- a/1. AGREEMENT/1. General-Purpose Contract/1 Master Agreement for License of the Thought Formalization Procedure Right and the Complete Definition System.docx
+++ b/1. AGREEMENT/1. General-Purpose Contract/1 Master Agreement for License of the Thought Formalization Procedure Right and the Complete Definition System.docx
@@ -11,8 +11,8 @@
           <w:szCs w:val="20"/>
         </w:rPr>
       </w:pPr>
-      <w:bookmarkStart w:id="0" w:name="OLE_LINK12"/>
-      <w:bookmarkStart w:id="1" w:name="OLE_LINK14"/>
+      <w:bookmarkStart w:id="0" w:name="OLE_LINK14"/>
+      <w:bookmarkStart w:id="1" w:name="OLE_LINK12"/>
       <w:r>
         <w:rPr>
           <w:rFonts w:ascii="ヒラギノ明朝 ProN W3" w:eastAsia="ヒラギノ明朝 ProN W3" w:hAnsi="ヒラギノ明朝 ProN W3" w:hint="eastAsia"/>
@@ -37,10 +37,28 @@
           <w:sz w:val="20"/>
           <w:szCs w:val="20"/>
         </w:rPr>
-        <w:t>Master Agreement for License of the Thought Formalization Procedure Right and the Complete Definition System</w:t>
-      </w:r>
-    </w:p>
-    <w:bookmarkEnd w:id="1"/>
+        <w:t>Master Agreement for License of the Thought Formalization Procedure Right and</w:t>
+      </w:r>
+    </w:p>
+    <w:p>
+      <w:pPr>
+        <w:jc w:val="center"/>
+        <w:rPr>
+          <w:rFonts w:ascii="ヒラギノ明朝 ProN W3" w:eastAsia="ヒラギノ明朝 ProN W3" w:hAnsi="ヒラギノ明朝 ProN W3"/>
+          <w:sz w:val="20"/>
+          <w:szCs w:val="20"/>
+        </w:rPr>
+      </w:pPr>
+      <w:r>
+        <w:rPr>
+          <w:rFonts w:ascii="ヒラギノ明朝 ProN W3" w:eastAsia="ヒラギノ明朝 ProN W3" w:hAnsi="ヒラギノ明朝 ProN W3"/>
+          <w:sz w:val="20"/>
+          <w:szCs w:val="20"/>
+        </w:rPr>
+        <w:t>the Complete Definition System</w:t>
+      </w:r>
+    </w:p>
+    <w:bookmarkEnd w:id="0"/>
     <w:p>
       <w:pPr>
         <w:rPr>
@@ -408,15 +426,6 @@
     <w:p>
       <w:pPr>
         <w:rPr>
-          <w:rFonts w:ascii="ヒラギノ明朝 ProN W3" w:eastAsia="ヒラギノ明朝 ProN W3" w:hAnsi="ヒラギノ明朝 ProN W3" w:hint="eastAsia"/>
-          <w:sz w:val="20"/>
-          <w:szCs w:val="20"/>
-        </w:rPr>
-      </w:pPr>
-    </w:p>
-    <w:p>
-      <w:pPr>
-        <w:rPr>
           <w:rFonts w:ascii="ヒラギノ明朝 ProN W3" w:eastAsia="ヒラギノ明朝 ProN W3" w:hAnsi="ヒラギノ明朝 ProN W3"/>
           <w:sz w:val="20"/>
           <w:szCs w:val="20"/>
@@ -429,7 +438,24 @@
           <w:szCs w:val="20"/>
         </w:rPr>
         <w:lastRenderedPageBreak/>
-        <w:t>2. 当事者は、本契約がAIを介した文案を基礎としつつも、その最終的な法的意味内容の確定は、日本国裁判所、特に東京地方裁判所</w:t>
+        <w:t>2. 当事者は、本契約がAIを介した文案を基礎としつつも、その最終的な法的意味内容の確定は、日本国裁判所、</w:t>
+      </w:r>
+    </w:p>
+    <w:p>
+      <w:pPr>
+        <w:rPr>
+          <w:rFonts w:ascii="ヒラギノ明朝 ProN W3" w:eastAsia="ヒラギノ明朝 ProN W3" w:hAnsi="ヒラギノ明朝 ProN W3"/>
+          <w:sz w:val="20"/>
+          <w:szCs w:val="20"/>
+        </w:rPr>
+      </w:pPr>
+      <w:r>
+        <w:rPr>
+          <w:rFonts w:ascii="ヒラギノ明朝 ProN W3" w:eastAsia="ヒラギノ明朝 ProN W3" w:hAnsi="ヒラギノ明朝 ProN W3"/>
+          <w:sz w:val="20"/>
+          <w:szCs w:val="20"/>
+        </w:rPr>
+        <w:t>特に東京地方裁判所</w:t>
       </w:r>
       <w:r>
         <w:rPr>
@@ -597,7 +623,7 @@
     <w:p>
       <w:pPr>
         <w:rPr>
-          <w:rFonts w:ascii="ヒラギノ明朝 ProN W3" w:eastAsia="ヒラギノ明朝 ProN W3" w:hAnsi="ヒラギノ明朝 ProN W3" w:hint="eastAsia"/>
+          <w:rFonts w:ascii="ヒラギノ明朝 ProN W3" w:eastAsia="ヒラギノ明朝 ProN W3" w:hAnsi="ヒラギノ明朝 ProN W3"/>
           <w:sz w:val="20"/>
           <w:szCs w:val="20"/>
         </w:rPr>
@@ -922,7 +948,7 @@
     <w:p>
       <w:pPr>
         <w:rPr>
-          <w:rFonts w:ascii="ヒラギノ明朝 ProN W3" w:eastAsia="ヒラギノ明朝 ProN W3" w:hAnsi="ヒラギノ明朝 ProN W3" w:hint="eastAsia"/>
+          <w:rFonts w:ascii="ヒラギノ明朝 ProN W3" w:eastAsia="ヒラギノ明朝 ProN W3" w:hAnsi="ヒラギノ明朝 ProN W3"/>
           <w:sz w:val="20"/>
           <w:szCs w:val="20"/>
         </w:rPr>
@@ -1422,7 +1448,7 @@
     <w:p>
       <w:pPr>
         <w:rPr>
-          <w:rFonts w:ascii="ヒラギノ明朝 ProN W3" w:eastAsia="ヒラギノ明朝 ProN W3" w:hAnsi="ヒラギノ明朝 ProN W3" w:hint="eastAsia"/>
+          <w:rFonts w:ascii="ヒラギノ明朝 ProN W3" w:eastAsia="ヒラギノ明朝 ProN W3" w:hAnsi="ヒラギノ明朝 ProN W3"/>
           <w:sz w:val="20"/>
           <w:szCs w:val="20"/>
         </w:rPr>
@@ -1645,7 +1671,7 @@
     <w:p>
       <w:pPr>
         <w:rPr>
-          <w:rFonts w:ascii="ヒラギノ明朝 ProN W3" w:eastAsia="ヒラギノ明朝 ProN W3" w:hAnsi="ヒラギノ明朝 ProN W3" w:hint="eastAsia"/>
+          <w:rFonts w:ascii="ヒラギノ明朝 ProN W3" w:eastAsia="ヒラギノ明朝 ProN W3" w:hAnsi="ヒラギノ明朝 ProN W3"/>
           <w:sz w:val="20"/>
           <w:szCs w:val="20"/>
         </w:rPr>
@@ -1878,7 +1904,40 @@
           <w:sz w:val="20"/>
           <w:szCs w:val="20"/>
         </w:rPr>
-        <w:t>2. 日本国内からの支払については、日本円建て支払が許容される場合においても、別紙に記載された米ドル額相当額以上を支払う義務を負うものとします。</w:t>
+        <w:t>2.</w:t>
+      </w:r>
+      <w:r>
+        <w:rPr>
+          <w:rFonts w:ascii="ヒラギノ明朝 ProN W3" w:eastAsia="ヒラギノ明朝 ProN W3" w:hAnsi="ヒラギノ明朝 ProN W3"/>
+          <w:sz w:val="20"/>
+          <w:szCs w:val="20"/>
+        </w:rPr>
+        <w:t xml:space="preserve"> </w:t>
+      </w:r>
+      <w:r>
+        <w:rPr>
+          <w:rFonts w:ascii="ヒラギノ明朝 ProN W3" w:eastAsia="ヒラギノ明朝 ProN W3" w:hAnsi="ヒラギノ明朝 ProN W3"/>
+          <w:sz w:val="20"/>
+          <w:szCs w:val="20"/>
+        </w:rPr>
+        <w:t>支払通貨は原則USDとし、日本国内居住者に限り円建て支払を認めます。この場合、当該円額は、別紙記載の</w:t>
+      </w:r>
+    </w:p>
+    <w:p>
+      <w:pPr>
+        <w:rPr>
+          <w:rFonts w:ascii="ヒラギノ明朝 ProN W3" w:eastAsia="ヒラギノ明朝 ProN W3" w:hAnsi="ヒラギノ明朝 ProN W3"/>
+          <w:sz w:val="20"/>
+          <w:szCs w:val="20"/>
+        </w:rPr>
+      </w:pPr>
+      <w:r>
+        <w:rPr>
+          <w:rFonts w:ascii="ヒラギノ明朝 ProN W3" w:eastAsia="ヒラギノ明朝 ProN W3" w:hAnsi="ヒラギノ明朝 ProN W3"/>
+          <w:sz w:val="20"/>
+          <w:szCs w:val="20"/>
+        </w:rPr>
+        <w:t>金額を「1 USD = 125 JPY」の固定レートで換算した額以上とし、支払期日は毎月22日（金融機関休業日の場合は翌営業日）とします。</w:t>
       </w:r>
     </w:p>
     <w:p>
@@ -1921,31 +1980,61 @@
           <w:sz w:val="20"/>
           <w:szCs w:val="20"/>
         </w:rPr>
-        <w:t>If you pay in yen from inside Japan, you still have to meet or exceed the USD amount defined in the schedule. No exchange rate games.</w:t>
-      </w:r>
-    </w:p>
-    <w:p>
-      <w:pPr>
-        <w:rPr>
-          <w:rFonts w:ascii="ヒラギノ明朝 ProN W3" w:eastAsia="ヒラギノ明朝 ProN W3" w:hAnsi="ヒラギノ明朝 ProN W3"/>
-          <w:sz w:val="20"/>
-          <w:szCs w:val="20"/>
-        </w:rPr>
-      </w:pPr>
-    </w:p>
-    <w:p>
-      <w:pPr>
-        <w:rPr>
-          <w:rFonts w:ascii="ヒラギノ明朝 ProN W3" w:eastAsia="ヒラギノ明朝 ProN W3" w:hAnsi="ヒラギノ明朝 ProN W3"/>
-          <w:sz w:val="20"/>
-          <w:szCs w:val="20"/>
-        </w:rPr>
-      </w:pPr>
-    </w:p>
-    <w:p>
-      <w:pPr>
-        <w:rPr>
-          <w:rFonts w:ascii="ヒラギノ明朝 ProN W3" w:eastAsia="ヒラギノ明朝 ProN W3" w:hAnsi="ヒラギノ明朝 ProN W3" w:hint="eastAsia"/>
+        <w:t>Default currency is USD.</w:t>
+      </w:r>
+      <w:r>
+        <w:rPr>
+          <w:rFonts w:ascii="ヒラギノ明朝 ProN W3" w:eastAsia="ヒラギノ明朝 ProN W3" w:hAnsi="ヒラギノ明朝 ProN W3"/>
+          <w:sz w:val="20"/>
+          <w:szCs w:val="20"/>
+        </w:rPr>
+        <w:t xml:space="preserve"> </w:t>
+      </w:r>
+      <w:r>
+        <w:rPr>
+          <w:rFonts w:ascii="ヒラギノ明朝 ProN W3" w:eastAsia="ヒラギノ明朝 ProN W3" w:hAnsi="ヒラギノ明朝 ProN W3"/>
+          <w:sz w:val="20"/>
+          <w:szCs w:val="20"/>
+        </w:rPr>
+        <w:t>If you’re based in Japan, you may pay in yen — but it still has to clear the fixed 125-to-1 line, no exceptions.</w:t>
+      </w:r>
+      <w:r>
+        <w:rPr>
+          <w:rFonts w:ascii="ヒラギノ明朝 ProN W3" w:eastAsia="ヒラギノ明朝 ProN W3" w:hAnsi="ヒラギノ明朝 ProN W3"/>
+          <w:sz w:val="20"/>
+          <w:szCs w:val="20"/>
+        </w:rPr>
+        <w:t xml:space="preserve"> </w:t>
+      </w:r>
+      <w:r>
+        <w:rPr>
+          <w:rFonts w:ascii="ヒラギノ明朝 ProN W3" w:eastAsia="ヒラギノ明朝 ProN W3" w:hAnsi="ヒラギノ明朝 ProN W3"/>
+          <w:sz w:val="20"/>
+          <w:szCs w:val="20"/>
+        </w:rPr>
+        <w:t>And the deadline is the twenty second of each month, or the next business day if banks are closed.</w:t>
+      </w:r>
+      <w:r>
+        <w:rPr>
+          <w:rFonts w:ascii="ヒラギノ明朝 ProN W3" w:eastAsia="ヒラギノ明朝 ProN W3" w:hAnsi="ヒラギノ明朝 ProN W3"/>
+          <w:sz w:val="20"/>
+          <w:szCs w:val="20"/>
+        </w:rPr>
+        <w:t xml:space="preserve"> </w:t>
+      </w:r>
+      <w:r>
+        <w:rPr>
+          <w:rFonts w:ascii="ヒラギノ明朝 ProN W3" w:eastAsia="ヒラギノ明朝 ProN W3" w:hAnsi="ヒラギノ明朝 ProN W3"/>
+          <w:sz w:val="20"/>
+          <w:szCs w:val="20"/>
+        </w:rPr>
+        <w:t>You don’t get extra time. You hit the date.</w:t>
+      </w:r>
+    </w:p>
+    <w:p>
+      <w:pPr>
+        <w:rPr>
+          <w:rFonts w:ascii="ヒラギノ明朝 ProN W3" w:eastAsia="ヒラギノ明朝 ProN W3" w:hAnsi="ヒラギノ明朝 ProN W3"/>
           <w:sz w:val="20"/>
           <w:szCs w:val="20"/>
         </w:rPr>
@@ -2536,16 +2625,16 @@
     <w:p>
       <w:pPr>
         <w:rPr>
-          <w:rFonts w:ascii="ヒラギノ明朝 ProN W3" w:eastAsia="ヒラギノ明朝 ProN W3" w:hAnsi="ヒラギノ明朝 ProN W3" w:hint="eastAsia"/>
-          <w:sz w:val="20"/>
-          <w:szCs w:val="20"/>
-        </w:rPr>
-      </w:pPr>
-    </w:p>
-    <w:p>
-      <w:pPr>
-        <w:rPr>
-          <w:rFonts w:ascii="ヒラギノ明朝 ProN W3" w:eastAsia="ヒラギノ明朝 ProN W3" w:hAnsi="ヒラギノ明朝 ProN W3" w:hint="eastAsia"/>
+          <w:rFonts w:ascii="ヒラギノ明朝 ProN W3" w:eastAsia="ヒラギノ明朝 ProN W3" w:hAnsi="ヒラギノ明朝 ProN W3"/>
+          <w:sz w:val="20"/>
+          <w:szCs w:val="20"/>
+        </w:rPr>
+      </w:pPr>
+    </w:p>
+    <w:p>
+      <w:pPr>
+        <w:rPr>
+          <w:rFonts w:ascii="ヒラギノ明朝 ProN W3" w:eastAsia="ヒラギノ明朝 ProN W3" w:hAnsi="ヒラギノ明朝 ProN W3"/>
           <w:sz w:val="20"/>
           <w:szCs w:val="20"/>
         </w:rPr>
@@ -2843,7 +2932,7 @@
     <w:p>
       <w:pPr>
         <w:rPr>
-          <w:rFonts w:ascii="ヒラギノ明朝 ProN W3" w:eastAsia="ヒラギノ明朝 ProN W3" w:hAnsi="ヒラギノ明朝 ProN W3" w:hint="eastAsia"/>
+          <w:rFonts w:ascii="ヒラギノ明朝 ProN W3" w:eastAsia="ヒラギノ明朝 ProN W3" w:hAnsi="ヒラギノ明朝 ProN W3"/>
           <w:sz w:val="20"/>
           <w:szCs w:val="20"/>
         </w:rPr>
@@ -3074,7 +3163,7 @@
     <w:p>
       <w:pPr>
         <w:rPr>
-          <w:rFonts w:ascii="ヒラギノ明朝 ProN W3" w:eastAsia="ヒラギノ明朝 ProN W3" w:hAnsi="ヒラギノ明朝 ProN W3" w:hint="eastAsia"/>
+          <w:rFonts w:ascii="ヒラギノ明朝 ProN W3" w:eastAsia="ヒラギノ明朝 ProN W3" w:hAnsi="ヒラギノ明朝 ProN W3"/>
           <w:sz w:val="20"/>
           <w:szCs w:val="20"/>
         </w:rPr>
@@ -3693,7 +3782,7 @@
     <w:p>
       <w:pPr>
         <w:rPr>
-          <w:rFonts w:ascii="ヒラギノ明朝 ProN W3" w:eastAsia="ヒラギノ明朝 ProN W3" w:hAnsi="ヒラギノ明朝 ProN W3" w:hint="eastAsia"/>
+          <w:rFonts w:ascii="ヒラギノ明朝 ProN W3" w:eastAsia="ヒラギノ明朝 ProN W3" w:hAnsi="ヒラギノ明朝 ProN W3"/>
           <w:sz w:val="20"/>
           <w:szCs w:val="20"/>
         </w:rPr>
@@ -3994,7 +4083,7 @@
     <w:p>
       <w:pPr>
         <w:rPr>
-          <w:rFonts w:ascii="ヒラギノ明朝 ProN W3" w:eastAsia="ヒラギノ明朝 ProN W3" w:hAnsi="ヒラギノ明朝 ProN W3" w:hint="eastAsia"/>
+          <w:rFonts w:ascii="ヒラギノ明朝 ProN W3" w:eastAsia="ヒラギノ明朝 ProN W3" w:hAnsi="ヒラギノ明朝 ProN W3"/>
           <w:sz w:val="20"/>
           <w:szCs w:val="20"/>
         </w:rPr>
@@ -4056,7 +4145,24 @@
           <w:sz w:val="20"/>
           <w:szCs w:val="20"/>
         </w:rPr>
-        <w:t>1. 本契約は、日本語条文と英語による解説的条文（Harvey Specter による説明）から構成されます。両者の間に解釈上の齟齬がある場合、日本語条文が優先されます。</w:t>
+        <w:t>1. 本契約は、日本語条文と英語による解説的条文（Harvey Specter による説明）から構成されます。両者の間に</w:t>
+      </w:r>
+    </w:p>
+    <w:p>
+      <w:pPr>
+        <w:rPr>
+          <w:rFonts w:ascii="ヒラギノ明朝 ProN W3" w:eastAsia="ヒラギノ明朝 ProN W3" w:hAnsi="ヒラギノ明朝 ProN W3"/>
+          <w:sz w:val="20"/>
+          <w:szCs w:val="20"/>
+        </w:rPr>
+      </w:pPr>
+      <w:r>
+        <w:rPr>
+          <w:rFonts w:ascii="ヒラギノ明朝 ProN W3" w:eastAsia="ヒラギノ明朝 ProN W3" w:hAnsi="ヒラギノ明朝 ProN W3"/>
+          <w:sz w:val="20"/>
+          <w:szCs w:val="20"/>
+        </w:rPr>
+        <w:t>解釈上の齟齬がある場合、日本語条文が優先されます。</w:t>
       </w:r>
     </w:p>
     <w:p>
@@ -4239,15 +4345,6 @@
         </w:rPr>
         <w:t>Kimura commits to making the English as clear as possible, but everyone agrees the court has the final say on meaning. Not the AI. Not the character. The judge.</w:t>
       </w:r>
-    </w:p>
-    <w:p>
-      <w:pPr>
-        <w:rPr>
-          <w:rFonts w:ascii="ヒラギノ明朝 ProN W3" w:eastAsia="ヒラギノ明朝 ProN W3" w:hAnsi="ヒラギノ明朝 ProN W3"/>
-          <w:sz w:val="20"/>
-          <w:szCs w:val="20"/>
-        </w:rPr>
-      </w:pPr>
     </w:p>
     <w:p>
       <w:pPr>
@@ -4823,15 +4920,6 @@
     <w:p>
       <w:pPr>
         <w:rPr>
-          <w:rFonts w:ascii="ヒラギノ明朝 ProN W3" w:eastAsia="ヒラギノ明朝 ProN W3" w:hAnsi="ヒラギノ明朝 ProN W3" w:hint="eastAsia"/>
-          <w:sz w:val="20"/>
-          <w:szCs w:val="20"/>
-        </w:rPr>
-      </w:pPr>
-    </w:p>
-    <w:p>
-      <w:pPr>
-        <w:rPr>
           <w:rFonts w:ascii="ヒラギノ明朝 ProN W3" w:eastAsia="ヒラギノ明朝 ProN W3" w:hAnsi="ヒラギノ明朝 ProN W3"/>
           <w:sz w:val="20"/>
           <w:szCs w:val="20"/>
@@ -5198,7 +5286,7 @@
     <w:p>
       <w:pPr>
         <w:rPr>
-          <w:rFonts w:ascii="ヒラギノ明朝 ProN W3" w:eastAsia="ヒラギノ明朝 ProN W3" w:hAnsi="ヒラギノ明朝 ProN W3" w:hint="eastAsia"/>
+          <w:rFonts w:ascii="ヒラギノ明朝 ProN W3" w:eastAsia="ヒラギノ明朝 ProN W3" w:hAnsi="ヒラギノ明朝 ProN W3"/>
           <w:sz w:val="20"/>
           <w:szCs w:val="20"/>
         </w:rPr>
@@ -6039,7 +6127,7 @@
         </w:rPr>
         <w:t>Signature blocks, dates, prices, and plan names are all handled per counterparty in the annexes and signature pages. This master is the skeleton. Every specific deal you strike will hang its flesh on these bones.</w:t>
       </w:r>
-      <w:bookmarkEnd w:id="0"/>
+      <w:bookmarkEnd w:id="1"/>
     </w:p>
     <w:p>
       <w:pPr>
@@ -6303,12 +6391,85 @@
           <w:szCs w:val="20"/>
         </w:rPr>
       </w:pPr>
-      <w:r>
-        <w:rPr>
-          <w:rFonts w:ascii="ヒラギノ明朝 ProN W3" w:eastAsia="ヒラギノ明朝 ProN W3" w:hAnsi="ヒラギノ明朝 ProN W3"/>
-          <w:sz w:val="20"/>
-          <w:szCs w:val="20"/>
-        </w:rPr>
+    </w:p>
+    <w:p>
+      <w:pPr>
+        <w:rPr>
+          <w:rFonts w:ascii="ヒラギノ明朝 ProN W3" w:eastAsia="ヒラギノ明朝 ProN W3" w:hAnsi="ヒラギノ明朝 ProN W3"/>
+          <w:sz w:val="20"/>
+          <w:szCs w:val="20"/>
+        </w:rPr>
+      </w:pPr>
+    </w:p>
+    <w:p>
+      <w:pPr>
+        <w:rPr>
+          <w:rFonts w:ascii="ヒラギノ明朝 ProN W3" w:eastAsia="ヒラギノ明朝 ProN W3" w:hAnsi="ヒラギノ明朝 ProN W3"/>
+          <w:sz w:val="20"/>
+          <w:szCs w:val="20"/>
+        </w:rPr>
+      </w:pPr>
+    </w:p>
+    <w:p>
+      <w:pPr>
+        <w:rPr>
+          <w:rFonts w:ascii="ヒラギノ明朝 ProN W3" w:eastAsia="ヒラギノ明朝 ProN W3" w:hAnsi="ヒラギノ明朝 ProN W3"/>
+          <w:sz w:val="20"/>
+          <w:szCs w:val="20"/>
+        </w:rPr>
+      </w:pPr>
+    </w:p>
+    <w:p>
+      <w:pPr>
+        <w:rPr>
+          <w:rFonts w:ascii="ヒラギノ明朝 ProN W3" w:eastAsia="ヒラギノ明朝 ProN W3" w:hAnsi="ヒラギノ明朝 ProN W3"/>
+          <w:sz w:val="20"/>
+          <w:szCs w:val="20"/>
+        </w:rPr>
+      </w:pPr>
+    </w:p>
+    <w:p>
+      <w:pPr>
+        <w:rPr>
+          <w:rFonts w:ascii="ヒラギノ明朝 ProN W3" w:eastAsia="ヒラギノ明朝 ProN W3" w:hAnsi="ヒラギノ明朝 ProN W3"/>
+          <w:sz w:val="20"/>
+          <w:szCs w:val="20"/>
+        </w:rPr>
+      </w:pPr>
+    </w:p>
+    <w:p>
+      <w:pPr>
+        <w:rPr>
+          <w:rFonts w:ascii="ヒラギノ明朝 ProN W3" w:eastAsia="ヒラギノ明朝 ProN W3" w:hAnsi="ヒラギノ明朝 ProN W3"/>
+          <w:sz w:val="20"/>
+          <w:szCs w:val="20"/>
+        </w:rPr>
+      </w:pPr>
+    </w:p>
+    <w:p>
+      <w:pPr>
+        <w:rPr>
+          <w:rFonts w:ascii="ヒラギノ明朝 ProN W3" w:eastAsia="ヒラギノ明朝 ProN W3" w:hAnsi="ヒラギノ明朝 ProN W3"/>
+          <w:sz w:val="20"/>
+          <w:szCs w:val="20"/>
+        </w:rPr>
+      </w:pPr>
+    </w:p>
+    <w:p>
+      <w:pPr>
+        <w:rPr>
+          <w:rFonts w:ascii="ヒラギノ明朝 ProN W3" w:eastAsia="ヒラギノ明朝 ProN W3" w:hAnsi="ヒラギノ明朝 ProN W3"/>
+          <w:sz w:val="20"/>
+          <w:szCs w:val="20"/>
+        </w:rPr>
+      </w:pPr>
+      <w:r>
+        <w:rPr>
+          <w:rFonts w:ascii="ヒラギノ明朝 ProN W3" w:eastAsia="ヒラギノ明朝 ProN W3" w:hAnsi="ヒラギノ明朝 ProN W3"/>
+          <w:sz w:val="20"/>
+          <w:szCs w:val="20"/>
+        </w:rPr>
+        <w:lastRenderedPageBreak/>
         <w:t>3.</w:t>
       </w:r>
       <w:r>
@@ -6413,14 +6574,801 @@
           <w:szCs w:val="20"/>
         </w:rPr>
       </w:pPr>
-      <w:r>
-        <w:rPr>
-          <w:rFonts w:ascii="ヒラギノ明朝 ProN W3" w:eastAsia="ヒラギノ明朝 ProN W3" w:hAnsi="ヒラギノ明朝 ProN W3"/>
+    </w:p>
+    <w:p>
+      <w:pPr>
+        <w:rPr>
+          <w:rFonts w:ascii="ヒラギノ明朝 ProN W3" w:eastAsia="ヒラギノ明朝 ProN W3" w:hAnsi="ヒラギノ明朝 ProN W3"/>
+          <w:sz w:val="20"/>
+          <w:szCs w:val="20"/>
+        </w:rPr>
+      </w:pPr>
+      <w:r>
+        <w:rPr>
+          <w:rFonts w:ascii="ヒラギノ明朝 ProN W3" w:eastAsia="ヒラギノ明朝 ProN W3" w:hAnsi="ヒラギノ明朝 ProN W3"/>
+          <w:sz w:val="20"/>
+          <w:szCs w:val="20"/>
+        </w:rPr>
+        <w:t>4.</w:t>
+      </w:r>
+      <w:r>
+        <w:rPr>
+          <w:rFonts w:ascii="ヒラギノ明朝 ProN W3" w:eastAsia="ヒラギノ明朝 ProN W3" w:hAnsi="ヒラギノ明朝 ProN W3"/>
+          <w:sz w:val="20"/>
+          <w:szCs w:val="20"/>
+        </w:rPr>
+        <w:t xml:space="preserve"> </w:t>
+      </w:r>
+      <w:r>
+        <w:rPr>
+          <w:rFonts w:ascii="ヒラギノ明朝 ProN W3" w:eastAsia="ヒラギノ明朝 ProN W3" w:hAnsi="ヒラギノ明朝 ProN W3"/>
+          <w:sz w:val="20"/>
+          <w:szCs w:val="20"/>
+        </w:rPr>
+        <w:t>前項に定めるアップロードは、当該Gitリポジトリに記録されるコミットハッシュ及びタイムスタンプにより</w:t>
+      </w:r>
+    </w:p>
+    <w:p>
+      <w:pPr>
+        <w:rPr>
+          <w:rFonts w:ascii="ヒラギノ明朝 ProN W3" w:eastAsia="ヒラギノ明朝 ProN W3" w:hAnsi="ヒラギノ明朝 ProN W3"/>
+          <w:sz w:val="20"/>
+          <w:szCs w:val="20"/>
+        </w:rPr>
+      </w:pPr>
+      <w:r>
+        <w:rPr>
+          <w:rFonts w:ascii="ヒラギノ明朝 ProN W3" w:eastAsia="ヒラギノ明朝 ProN W3" w:hAnsi="ヒラギノ明朝 ProN W3"/>
+          <w:sz w:val="20"/>
+          <w:szCs w:val="20"/>
+        </w:rPr>
+        <w:t>客観的に証明されるものとし、当事者は、これらが本契約及び別紙の効力発生時期に関する第一次的な証拠となる</w:t>
+      </w:r>
+    </w:p>
+    <w:p>
+      <w:pPr>
+        <w:rPr>
+          <w:rFonts w:ascii="ヒラギノ明朝 ProN W3" w:eastAsia="ヒラギノ明朝 ProN W3" w:hAnsi="ヒラギノ明朝 ProN W3"/>
+          <w:sz w:val="20"/>
+          <w:szCs w:val="20"/>
+        </w:rPr>
+      </w:pPr>
+      <w:r>
+        <w:rPr>
+          <w:rFonts w:ascii="ヒラギノ明朝 ProN W3" w:eastAsia="ヒラギノ明朝 ProN W3" w:hAnsi="ヒラギノ明朝 ProN W3"/>
+          <w:sz w:val="20"/>
+          <w:szCs w:val="20"/>
+        </w:rPr>
+        <w:t>ことに合意します。</w:t>
+      </w:r>
+    </w:p>
+    <w:p>
+      <w:pPr>
+        <w:rPr>
+          <w:rFonts w:ascii="ヒラギノ明朝 ProN W3" w:eastAsia="ヒラギノ明朝 ProN W3" w:hAnsi="ヒラギノ明朝 ProN W3"/>
+          <w:sz w:val="20"/>
+          <w:szCs w:val="20"/>
+        </w:rPr>
+      </w:pPr>
+    </w:p>
+    <w:p>
+      <w:pPr>
+        <w:rPr>
+          <w:rFonts w:ascii="ヒラギノ明朝 ProN W3" w:eastAsia="ヒラギノ明朝 ProN W3" w:hAnsi="ヒラギノ明朝 ProN W3"/>
+          <w:sz w:val="20"/>
+          <w:szCs w:val="20"/>
+        </w:rPr>
+      </w:pPr>
+      <w:r>
+        <w:rPr>
+          <w:rFonts w:ascii="ヒラギノ明朝 ProN W3" w:eastAsia="ヒラギノ明朝 ProN W3" w:hAnsi="ヒラギノ明朝 ProN W3"/>
+          <w:sz w:val="20"/>
+          <w:szCs w:val="20"/>
+        </w:rPr>
+        <w:t>Harvey Specter:</w:t>
+      </w:r>
+    </w:p>
+    <w:p>
+      <w:pPr>
+        <w:rPr>
+          <w:rFonts w:ascii="ヒラギノ明朝 ProN W3" w:eastAsia="ヒラギノ明朝 ProN W3" w:hAnsi="ヒラギノ明朝 ProN W3"/>
+          <w:sz w:val="20"/>
+          <w:szCs w:val="20"/>
+        </w:rPr>
+      </w:pPr>
+      <w:r>
+        <w:rPr>
+          <w:rFonts w:ascii="ヒラギノ明朝 ProN W3" w:eastAsia="ヒラギノ明朝 ProN W3" w:hAnsi="ヒラギノ明朝 ProN W3"/>
+          <w:sz w:val="20"/>
+          <w:szCs w:val="20"/>
+        </w:rPr>
+        <w:t>The commit hash and timestamp in the repo are the time stamp. They are the primary evidence of when the contract took effect. You do not need a notary when you already have an immutable ledger.</w:t>
+      </w:r>
+    </w:p>
+    <w:p>
+      <w:pPr>
+        <w:rPr>
+          <w:rFonts w:ascii="ヒラギノ明朝 ProN W3" w:eastAsia="ヒラギノ明朝 ProN W3" w:hAnsi="ヒラギノ明朝 ProN W3"/>
+          <w:sz w:val="20"/>
+          <w:szCs w:val="20"/>
+        </w:rPr>
+      </w:pPr>
+    </w:p>
+    <w:p>
+      <w:pPr>
+        <w:rPr>
+          <w:rFonts w:ascii="ヒラギノ明朝 ProN W3" w:eastAsia="ヒラギノ明朝 ProN W3" w:hAnsi="ヒラギノ明朝 ProN W3"/>
+          <w:sz w:val="20"/>
+          <w:szCs w:val="20"/>
+        </w:rPr>
+      </w:pPr>
+      <w:r>
+        <w:rPr>
+          <w:rFonts w:ascii="ヒラギノ明朝 ProN W3" w:eastAsia="ヒラギノ明朝 ProN W3" w:hAnsi="ヒラギノ明朝 ProN W3"/>
+          <w:sz w:val="20"/>
+          <w:szCs w:val="20"/>
+        </w:rPr>
+        <w:t>5.</w:t>
+      </w:r>
+      <w:r>
+        <w:rPr>
+          <w:rFonts w:ascii="ヒラギノ明朝 ProN W3" w:eastAsia="ヒラギノ明朝 ProN W3" w:hAnsi="ヒラギノ明朝 ProN W3"/>
+          <w:sz w:val="20"/>
+          <w:szCs w:val="20"/>
+        </w:rPr>
+        <w:t xml:space="preserve"> </w:t>
+      </w:r>
+      <w:r>
+        <w:rPr>
+          <w:rFonts w:ascii="ヒラギノ明朝 ProN W3" w:eastAsia="ヒラギノ明朝 ProN W3" w:hAnsi="ヒラギノ明朝 ProN W3"/>
+          <w:sz w:val="20"/>
+          <w:szCs w:val="20"/>
+        </w:rPr>
+        <w:t>署名PDFがライセンサーの上記メールアドレスに到達したことのみをもっては、本契約及び別紙は効力を</w:t>
+      </w:r>
+    </w:p>
+    <w:p>
+      <w:pPr>
+        <w:rPr>
+          <w:rFonts w:ascii="ヒラギノ明朝 ProN W3" w:eastAsia="ヒラギノ明朝 ProN W3" w:hAnsi="ヒラギノ明朝 ProN W3"/>
+          <w:sz w:val="20"/>
+          <w:szCs w:val="20"/>
+        </w:rPr>
+      </w:pPr>
+      <w:r>
+        <w:rPr>
+          <w:rFonts w:ascii="ヒラギノ明朝 ProN W3" w:eastAsia="ヒラギノ明朝 ProN W3" w:hAnsi="ヒラギノ明朝 ProN W3"/>
+          <w:sz w:val="20"/>
+          <w:szCs w:val="20"/>
+        </w:rPr>
+        <w:t>生じないものとします。ライセンサーは、署名PDFを受領した後であっても、これをアップロードしない自由を</w:t>
+      </w:r>
+    </w:p>
+    <w:p>
+      <w:pPr>
+        <w:rPr>
+          <w:rFonts w:ascii="ヒラギノ明朝 ProN W3" w:eastAsia="ヒラギノ明朝 ProN W3" w:hAnsi="ヒラギノ明朝 ProN W3"/>
+          <w:sz w:val="20"/>
+          <w:szCs w:val="20"/>
+        </w:rPr>
+      </w:pPr>
+      <w:r>
+        <w:rPr>
+          <w:rFonts w:ascii="ヒラギノ明朝 ProN W3" w:eastAsia="ヒラギノ明朝 ProN W3" w:hAnsi="ヒラギノ明朝 ProN W3"/>
+          <w:sz w:val="20"/>
+          <w:szCs w:val="20"/>
+        </w:rPr>
+        <w:t>留保し、アップロードを行わない場合には、本契約は成立しないことにつき、ライセンシーはあらかじめ承諾します。</w:t>
+      </w:r>
+    </w:p>
+    <w:p>
+      <w:pPr>
+        <w:rPr>
+          <w:rFonts w:ascii="ヒラギノ明朝 ProN W3" w:eastAsia="ヒラギノ明朝 ProN W3" w:hAnsi="ヒラギノ明朝 ProN W3"/>
+          <w:sz w:val="20"/>
+          <w:szCs w:val="20"/>
+        </w:rPr>
+      </w:pPr>
+    </w:p>
+    <w:p>
+      <w:pPr>
+        <w:rPr>
+          <w:rFonts w:ascii="ヒラギノ明朝 ProN W3" w:eastAsia="ヒラギノ明朝 ProN W3" w:hAnsi="ヒラギノ明朝 ProN W3"/>
+          <w:sz w:val="20"/>
+          <w:szCs w:val="20"/>
+        </w:rPr>
+      </w:pPr>
+      <w:r>
+        <w:rPr>
+          <w:rFonts w:ascii="ヒラギノ明朝 ProN W3" w:eastAsia="ヒラギノ明朝 ProN W3" w:hAnsi="ヒラギノ明朝 ProN W3"/>
+          <w:sz w:val="20"/>
+          <w:szCs w:val="20"/>
+        </w:rPr>
+        <w:t>Harvey Specter:</w:t>
+      </w:r>
+    </w:p>
+    <w:p>
+      <w:pPr>
+        <w:rPr>
+          <w:rFonts w:ascii="ヒラギノ明朝 ProN W3" w:eastAsia="ヒラギノ明朝 ProN W3" w:hAnsi="ヒラギノ明朝 ProN W3"/>
+          <w:sz w:val="20"/>
+          <w:szCs w:val="20"/>
+        </w:rPr>
+      </w:pPr>
+      <w:r>
+        <w:rPr>
+          <w:rFonts w:ascii="ヒラギノ明朝 ProN W3" w:eastAsia="ヒラギノ明朝 ProN W3" w:hAnsi="ヒラギノ明朝 ProN W3"/>
+          <w:sz w:val="20"/>
+          <w:szCs w:val="20"/>
+        </w:rPr>
+        <w:t>Just sending the signed PDF does not bind Kimura. He keeps the right to walk away by simply not uploading it. No upload, no contract. That asymmetry is intentional — like a bearer bond that only becomes live when it is actually lodged in the vault.</w:t>
+      </w:r>
+    </w:p>
+    <w:p>
+      <w:pPr>
+        <w:rPr>
+          <w:rFonts w:ascii="ヒラギノ明朝 ProN W3" w:eastAsia="ヒラギノ明朝 ProN W3" w:hAnsi="ヒラギノ明朝 ProN W3"/>
+          <w:sz w:val="20"/>
+          <w:szCs w:val="20"/>
+        </w:rPr>
+      </w:pPr>
+    </w:p>
+    <w:p>
+      <w:pPr>
+        <w:rPr>
+          <w:rFonts w:ascii="ヒラギノ明朝 ProN W3" w:eastAsia="ヒラギノ明朝 ProN W3" w:hAnsi="ヒラギノ明朝 ProN W3"/>
+          <w:sz w:val="20"/>
+          <w:szCs w:val="20"/>
+        </w:rPr>
+      </w:pPr>
+      <w:r>
+        <w:rPr>
+          <w:rFonts w:ascii="ヒラギノ明朝 ProN W3" w:eastAsia="ヒラギノ明朝 ProN W3" w:hAnsi="ヒラギノ明朝 ProN W3"/>
+          <w:sz w:val="20"/>
+          <w:szCs w:val="20"/>
+        </w:rPr>
+        <w:t>6.</w:t>
+      </w:r>
+      <w:r>
+        <w:rPr>
+          <w:rFonts w:ascii="ヒラギノ明朝 ProN W3" w:eastAsia="ヒラギノ明朝 ProN W3" w:hAnsi="ヒラギノ明朝 ProN W3"/>
+          <w:sz w:val="20"/>
+          <w:szCs w:val="20"/>
+        </w:rPr>
+        <w:t xml:space="preserve"> </w:t>
+      </w:r>
+      <w:r>
+        <w:rPr>
+          <w:rFonts w:ascii="ヒラギノ明朝 ProN W3" w:eastAsia="ヒラギノ明朝 ProN W3" w:hAnsi="ヒラギノ明朝 ProN W3"/>
+          <w:sz w:val="20"/>
+          <w:szCs w:val="20"/>
+        </w:rPr>
+        <w:t>ライセンシーは、上記手続に従って送付される署名PDF以外の電子メール、添付ファイル又は通信手段について、ライセンサーが本契約又は別紙に関する正式な申込み若しくは承諾として取り扱う義務を負わないことを承諾し、</w:t>
+      </w:r>
+    </w:p>
+    <w:p>
+      <w:pPr>
+        <w:rPr>
+          <w:rFonts w:ascii="ヒラギノ明朝 ProN W3" w:eastAsia="ヒラギノ明朝 ProN W3" w:hAnsi="ヒラギノ明朝 ProN W3"/>
+          <w:sz w:val="20"/>
+          <w:szCs w:val="20"/>
+        </w:rPr>
+      </w:pPr>
+      <w:r>
+        <w:rPr>
+          <w:rFonts w:ascii="ヒラギノ明朝 ProN W3" w:eastAsia="ヒラギノ明朝 ProN W3" w:hAnsi="ヒラギノ明朝 ProN W3"/>
+          <w:sz w:val="20"/>
+          <w:szCs w:val="20"/>
+        </w:rPr>
+        <w:t>ライセンシー側の内部処理上の誤送信又は件名誤記等を理由として、本契約の成立又は効力発生を主張しないもの</w:t>
+      </w:r>
+    </w:p>
+    <w:p>
+      <w:pPr>
+        <w:rPr>
+          <w:rFonts w:ascii="ヒラギノ明朝 ProN W3" w:eastAsia="ヒラギノ明朝 ProN W3" w:hAnsi="ヒラギノ明朝 ProN W3"/>
+          <w:sz w:val="20"/>
+          <w:szCs w:val="20"/>
+        </w:rPr>
+      </w:pPr>
+      <w:r>
+        <w:rPr>
+          <w:rFonts w:ascii="ヒラギノ明朝 ProN W3" w:eastAsia="ヒラギノ明朝 ProN W3" w:hAnsi="ヒラギノ明朝 ProN W3"/>
+          <w:sz w:val="20"/>
+          <w:szCs w:val="20"/>
+        </w:rPr>
+        <w:t>とします。</w:t>
+      </w:r>
+    </w:p>
+    <w:p>
+      <w:pPr>
+        <w:rPr>
+          <w:rFonts w:ascii="ヒラギノ明朝 ProN W3" w:eastAsia="ヒラギノ明朝 ProN W3" w:hAnsi="ヒラギノ明朝 ProN W3"/>
+          <w:sz w:val="20"/>
+          <w:szCs w:val="20"/>
+        </w:rPr>
+      </w:pPr>
+    </w:p>
+    <w:p>
+      <w:pPr>
+        <w:rPr>
+          <w:rFonts w:ascii="ヒラギノ明朝 ProN W3" w:eastAsia="ヒラギノ明朝 ProN W3" w:hAnsi="ヒラギノ明朝 ProN W3"/>
+          <w:sz w:val="20"/>
+          <w:szCs w:val="20"/>
+        </w:rPr>
+      </w:pPr>
+      <w:r>
+        <w:rPr>
+          <w:rFonts w:ascii="ヒラギノ明朝 ProN W3" w:eastAsia="ヒラギノ明朝 ProN W3" w:hAnsi="ヒラギノ明朝 ProN W3"/>
+          <w:sz w:val="20"/>
+          <w:szCs w:val="20"/>
+        </w:rPr>
+        <w:t>Harvey Specter:</w:t>
+      </w:r>
+    </w:p>
+    <w:p>
+      <w:pPr>
+        <w:rPr>
+          <w:rFonts w:ascii="ヒラギノ明朝 ProN W3" w:eastAsia="ヒラギノ明朝 ProN W3" w:hAnsi="ヒラギノ明朝 ProN W3"/>
+          <w:sz w:val="20"/>
+          <w:szCs w:val="20"/>
+        </w:rPr>
+      </w:pPr>
+      <w:r>
+        <w:rPr>
+          <w:rFonts w:ascii="ヒラギノ明朝 ProN W3" w:eastAsia="ヒラギノ明朝 ProN W3" w:hAnsi="ヒラギノ明朝 ProN W3"/>
+          <w:sz w:val="20"/>
+          <w:szCs w:val="20"/>
+        </w:rPr>
+        <w:t>If you mis-send, mistype the subject, or route it through another channel, that is on you. You cannot later claim “but we intended to contract.” Intent without the prescribed procedure does not create this deal.</w:t>
+      </w:r>
+    </w:p>
+    <w:p>
+      <w:pPr>
+        <w:rPr>
+          <w:rFonts w:ascii="ヒラギノ明朝 ProN W3" w:eastAsia="ヒラギノ明朝 ProN W3" w:hAnsi="ヒラギノ明朝 ProN W3"/>
+          <w:sz w:val="20"/>
+          <w:szCs w:val="20"/>
+        </w:rPr>
+      </w:pPr>
+    </w:p>
+    <w:p>
+      <w:pPr>
+        <w:rPr>
+          <w:rFonts w:ascii="ヒラギノ明朝 ProN W3" w:eastAsia="ヒラギノ明朝 ProN W3" w:hAnsi="ヒラギノ明朝 ProN W3"/>
+          <w:sz w:val="20"/>
+          <w:szCs w:val="20"/>
+        </w:rPr>
+      </w:pPr>
+    </w:p>
+    <w:p>
+      <w:pPr>
+        <w:rPr>
+          <w:rFonts w:ascii="ヒラギノ明朝 ProN W3" w:eastAsia="ヒラギノ明朝 ProN W3" w:hAnsi="ヒラギノ明朝 ProN W3"/>
+          <w:sz w:val="20"/>
+          <w:szCs w:val="20"/>
+        </w:rPr>
+      </w:pPr>
+    </w:p>
+    <w:p>
+      <w:pPr>
+        <w:rPr>
+          <w:rFonts w:ascii="ヒラギノ明朝 ProN W3" w:eastAsia="ヒラギノ明朝 ProN W3" w:hAnsi="ヒラギノ明朝 ProN W3"/>
+          <w:sz w:val="20"/>
+          <w:szCs w:val="20"/>
+        </w:rPr>
+      </w:pPr>
+    </w:p>
+    <w:p>
+      <w:pPr>
+        <w:rPr>
+          <w:rFonts w:ascii="ヒラギノ明朝 ProN W3" w:eastAsia="ヒラギノ明朝 ProN W3" w:hAnsi="ヒラギノ明朝 ProN W3"/>
+          <w:sz w:val="20"/>
+          <w:szCs w:val="20"/>
+        </w:rPr>
+      </w:pPr>
+    </w:p>
+    <w:p>
+      <w:pPr>
+        <w:rPr>
+          <w:rFonts w:ascii="ヒラギノ明朝 ProN W3" w:eastAsia="ヒラギノ明朝 ProN W3" w:hAnsi="ヒラギノ明朝 ProN W3"/>
+          <w:sz w:val="20"/>
+          <w:szCs w:val="20"/>
+        </w:rPr>
+      </w:pPr>
+    </w:p>
+    <w:p>
+      <w:pPr>
+        <w:jc w:val="center"/>
+        <w:rPr>
+          <w:rFonts w:ascii="ヒラギノ明朝 ProN W3" w:eastAsia="ヒラギノ明朝 ProN W3" w:hAnsi="ヒラギノ明朝 ProN W3"/>
+          <w:sz w:val="20"/>
+          <w:szCs w:val="20"/>
+        </w:rPr>
+      </w:pPr>
+    </w:p>
+    <w:p>
+      <w:pPr>
+        <w:jc w:val="center"/>
+        <w:rPr>
+          <w:rFonts w:ascii="ヒラギノ明朝 ProN W3" w:eastAsia="ヒラギノ明朝 ProN W3" w:hAnsi="ヒラギノ明朝 ProN W3"/>
+          <w:sz w:val="20"/>
+          <w:szCs w:val="20"/>
+        </w:rPr>
+      </w:pPr>
+      <w:r>
+        <w:rPr>
+          <w:rFonts w:ascii="ヒラギノ明朝 ProN W3" w:eastAsia="ヒラギノ明朝 ProN W3" w:hAnsi="ヒラギノ明朝 ProN W3" w:hint="eastAsia"/>
           <w:sz w:val="20"/>
           <w:szCs w:val="20"/>
         </w:rPr>
         <w:lastRenderedPageBreak/>
-        <w:t>4.</w:t>
+        <w:t>支払指示書</w:t>
+      </w:r>
+    </w:p>
+    <w:p>
+      <w:pPr>
+        <w:jc w:val="center"/>
+        <w:rPr>
+          <w:rFonts w:ascii="ヒラギノ明朝 ProN W3" w:eastAsia="ヒラギノ明朝 ProN W3" w:hAnsi="ヒラギノ明朝 ProN W3"/>
+          <w:sz w:val="20"/>
+          <w:szCs w:val="20"/>
+        </w:rPr>
+      </w:pPr>
+      <w:r>
+        <w:rPr>
+          <w:rFonts w:ascii="ヒラギノ明朝 ProN W3" w:eastAsia="ヒラギノ明朝 ProN W3" w:hAnsi="ヒラギノ明朝 ProN W3" w:hint="eastAsia"/>
+          <w:sz w:val="20"/>
+          <w:szCs w:val="20"/>
+        </w:rPr>
+        <w:t>（</w:t>
+      </w:r>
+      <w:r>
+        <w:rPr>
+          <w:rFonts w:ascii="ヒラギノ明朝 ProN W3" w:eastAsia="ヒラギノ明朝 ProN W3" w:hAnsi="ヒラギノ明朝 ProN W3"/>
+          <w:sz w:val="20"/>
+          <w:szCs w:val="20"/>
+        </w:rPr>
+        <w:t>Payment Instruction Sheet）</w:t>
+      </w:r>
+    </w:p>
+    <w:p>
+      <w:pPr>
+        <w:rPr>
+          <w:rFonts w:ascii="ヒラギノ明朝 ProN W3" w:eastAsia="ヒラギノ明朝 ProN W3" w:hAnsi="ヒラギノ明朝 ProN W3"/>
+          <w:sz w:val="20"/>
+          <w:szCs w:val="20"/>
+        </w:rPr>
+      </w:pPr>
+    </w:p>
+    <w:p>
+      <w:pPr>
+        <w:rPr>
+          <w:rFonts w:ascii="ヒラギノ明朝 ProN W3" w:eastAsia="ヒラギノ明朝 ProN W3" w:hAnsi="ヒラギノ明朝 ProN W3"/>
+          <w:sz w:val="20"/>
+          <w:szCs w:val="20"/>
+        </w:rPr>
+      </w:pPr>
+      <w:r>
+        <w:rPr>
+          <w:rFonts w:ascii="ヒラギノ明朝 ProN W3" w:eastAsia="ヒラギノ明朝 ProN W3" w:hAnsi="ヒラギノ明朝 ProN W3" w:hint="eastAsia"/>
+          <w:sz w:val="20"/>
+          <w:szCs w:val="20"/>
+        </w:rPr>
+        <w:t>本支払指示書は、本マスター契約及び別紙に基づきライセンシーが支払うべき月額ライセンス料その他の金銭支払について、振込先、通貨、為替基準等を定めるものであり、本契約の一部として同等の効力を有する。</w:t>
+      </w:r>
+    </w:p>
+    <w:p>
+      <w:pPr>
+        <w:rPr>
+          <w:rFonts w:ascii="ヒラギノ明朝 ProN W3" w:eastAsia="ヒラギノ明朝 ProN W3" w:hAnsi="ヒラギノ明朝 ProN W3"/>
+          <w:sz w:val="20"/>
+          <w:szCs w:val="20"/>
+        </w:rPr>
+      </w:pPr>
+    </w:p>
+    <w:p>
+      <w:pPr>
+        <w:rPr>
+          <w:rFonts w:ascii="ヒラギノ明朝 ProN W3" w:eastAsia="ヒラギノ明朝 ProN W3" w:hAnsi="ヒラギノ明朝 ProN W3"/>
+          <w:sz w:val="20"/>
+          <w:szCs w:val="20"/>
+        </w:rPr>
+      </w:pPr>
+      <w:r>
+        <w:rPr>
+          <w:rFonts w:ascii="ヒラギノ明朝 ProN W3" w:eastAsia="ヒラギノ明朝 ProN W3" w:hAnsi="ヒラギノ明朝 ProN W3"/>
+          <w:sz w:val="20"/>
+          <w:szCs w:val="20"/>
+        </w:rPr>
+        <w:t>Harvey Specter:</w:t>
+      </w:r>
+    </w:p>
+    <w:p>
+      <w:pPr>
+        <w:rPr>
+          <w:rFonts w:ascii="ヒラギノ明朝 ProN W3" w:eastAsia="ヒラギノ明朝 ProN W3" w:hAnsi="ヒラギノ明朝 ProN W3"/>
+          <w:sz w:val="20"/>
+          <w:szCs w:val="20"/>
+        </w:rPr>
+      </w:pPr>
+      <w:r>
+        <w:rPr>
+          <w:rFonts w:ascii="ヒラギノ明朝 ProN W3" w:eastAsia="ヒラギノ明朝 ProN W3" w:hAnsi="ヒラギノ明朝 ProN W3"/>
+          <w:sz w:val="20"/>
+          <w:szCs w:val="20"/>
+        </w:rPr>
+        <w:t>This Payment Instruction Sheet is not an attachment you can ignore. It is part of the contract. It tells you where the money goes, how it must be sent, and what currency rules apply. If you pay wrong, late, or light, that is on you.</w:t>
+      </w:r>
+    </w:p>
+    <w:p>
+      <w:pPr>
+        <w:rPr>
+          <w:rFonts w:ascii="ヒラギノ明朝 ProN W3" w:eastAsia="ヒラギノ明朝 ProN W3" w:hAnsi="ヒラギノ明朝 ProN W3"/>
+          <w:sz w:val="20"/>
+          <w:szCs w:val="20"/>
+        </w:rPr>
+      </w:pPr>
+    </w:p>
+    <w:p>
+      <w:pPr>
+        <w:rPr>
+          <w:rFonts w:ascii="ヒラギノ明朝 ProN W3" w:eastAsia="ヒラギノ明朝 ProN W3" w:hAnsi="ヒラギノ明朝 ProN W3"/>
+          <w:sz w:val="20"/>
+          <w:szCs w:val="20"/>
+        </w:rPr>
+      </w:pPr>
+      <w:r>
+        <w:rPr>
+          <w:rFonts w:ascii="ヒラギノ明朝 ProN W3" w:eastAsia="ヒラギノ明朝 ProN W3" w:hAnsi="ヒラギノ明朝 ProN W3" w:hint="eastAsia"/>
+          <w:sz w:val="20"/>
+          <w:szCs w:val="20"/>
+        </w:rPr>
+        <w:t>第</w:t>
+      </w:r>
+      <w:r>
+        <w:rPr>
+          <w:rFonts w:ascii="ヒラギノ明朝 ProN W3" w:eastAsia="ヒラギノ明朝 ProN W3" w:hAnsi="ヒラギノ明朝 ProN W3"/>
+          <w:sz w:val="20"/>
+          <w:szCs w:val="20"/>
+        </w:rPr>
+        <w:t>1条（振込先口座）</w:t>
+      </w:r>
+    </w:p>
+    <w:p>
+      <w:pPr>
+        <w:rPr>
+          <w:rFonts w:ascii="ヒラギノ明朝 ProN W3" w:eastAsia="ヒラギノ明朝 ProN W3" w:hAnsi="ヒラギノ明朝 ProN W3"/>
+          <w:sz w:val="20"/>
+          <w:szCs w:val="20"/>
+        </w:rPr>
+      </w:pPr>
+      <w:r>
+        <w:rPr>
+          <w:rFonts w:ascii="ヒラギノ明朝 ProN W3" w:eastAsia="ヒラギノ明朝 ProN W3" w:hAnsi="ヒラギノ明朝 ProN W3" w:hint="eastAsia"/>
+          <w:sz w:val="20"/>
+          <w:szCs w:val="20"/>
+        </w:rPr>
+        <w:t>以下の口座を、本契約及び別紙に基づく全ての支払の指定口座とする。</w:t>
+      </w:r>
+    </w:p>
+    <w:p>
+      <w:pPr>
+        <w:rPr>
+          <w:rFonts w:ascii="ヒラギノ明朝 ProN W3" w:eastAsia="ヒラギノ明朝 ProN W3" w:hAnsi="ヒラギノ明朝 ProN W3"/>
+          <w:sz w:val="20"/>
+          <w:szCs w:val="20"/>
+        </w:rPr>
+      </w:pPr>
+      <w:r>
+        <w:rPr>
+          <w:rFonts w:ascii="ヒラギノ明朝 ProN W3" w:eastAsia="ヒラギノ明朝 ProN W3" w:hAnsi="ヒラギノ明朝 ProN W3" w:hint="eastAsia"/>
+          <w:sz w:val="20"/>
+          <w:szCs w:val="20"/>
+        </w:rPr>
+        <w:t xml:space="preserve">　銀行名：三井住友銀行（</w:t>
+      </w:r>
+      <w:r>
+        <w:rPr>
+          <w:rFonts w:ascii="ヒラギノ明朝 ProN W3" w:eastAsia="ヒラギノ明朝 ProN W3" w:hAnsi="ヒラギノ明朝 ProN W3"/>
+          <w:sz w:val="20"/>
+          <w:szCs w:val="20"/>
+        </w:rPr>
+        <w:t>Sumitomo Mitsui Banking Corporation, SMBC）</w:t>
+      </w:r>
+    </w:p>
+    <w:p>
+      <w:pPr>
+        <w:rPr>
+          <w:rFonts w:ascii="ヒラギノ明朝 ProN W3" w:eastAsia="ヒラギノ明朝 ProN W3" w:hAnsi="ヒラギノ明朝 ProN W3"/>
+          <w:sz w:val="20"/>
+          <w:szCs w:val="20"/>
+        </w:rPr>
+      </w:pPr>
+      <w:r>
+        <w:rPr>
+          <w:rFonts w:ascii="ヒラギノ明朝 ProN W3" w:eastAsia="ヒラギノ明朝 ProN W3" w:hAnsi="ヒラギノ明朝 ProN W3" w:hint="eastAsia"/>
+          <w:sz w:val="20"/>
+          <w:szCs w:val="20"/>
+        </w:rPr>
+        <w:t xml:space="preserve">　支店名：八王子支店（</w:t>
+      </w:r>
+      <w:r>
+        <w:rPr>
+          <w:rFonts w:ascii="ヒラギノ明朝 ProN W3" w:eastAsia="ヒラギノ明朝 ProN W3" w:hAnsi="ヒラギノ明朝 ProN W3"/>
+          <w:sz w:val="20"/>
+          <w:szCs w:val="20"/>
+        </w:rPr>
+        <w:t>Hachioji Branch）</w:t>
+      </w:r>
+    </w:p>
+    <w:p>
+      <w:pPr>
+        <w:rPr>
+          <w:rFonts w:ascii="ヒラギノ明朝 ProN W3" w:eastAsia="ヒラギノ明朝 ProN W3" w:hAnsi="ヒラギノ明朝 ProN W3"/>
+          <w:sz w:val="20"/>
+          <w:szCs w:val="20"/>
+        </w:rPr>
+      </w:pPr>
+      <w:r>
+        <w:rPr>
+          <w:rFonts w:ascii="ヒラギノ明朝 ProN W3" w:eastAsia="ヒラギノ明朝 ProN W3" w:hAnsi="ヒラギノ明朝 ProN W3" w:hint="eastAsia"/>
+          <w:sz w:val="20"/>
+          <w:szCs w:val="20"/>
+        </w:rPr>
+        <w:t xml:space="preserve">　口座種別：普通預金（</w:t>
+      </w:r>
+      <w:r>
+        <w:rPr>
+          <w:rFonts w:ascii="ヒラギノ明朝 ProN W3" w:eastAsia="ヒラギノ明朝 ProN W3" w:hAnsi="ヒラギノ明朝 ProN W3"/>
+          <w:sz w:val="20"/>
+          <w:szCs w:val="20"/>
+        </w:rPr>
+        <w:t>Ordinary Deposit）</w:t>
+      </w:r>
+    </w:p>
+    <w:p>
+      <w:pPr>
+        <w:rPr>
+          <w:rFonts w:ascii="ヒラギノ明朝 ProN W3" w:eastAsia="ヒラギノ明朝 ProN W3" w:hAnsi="ヒラギノ明朝 ProN W3"/>
+          <w:sz w:val="20"/>
+          <w:szCs w:val="20"/>
+        </w:rPr>
+      </w:pPr>
+      <w:r>
+        <w:rPr>
+          <w:rFonts w:ascii="ヒラギノ明朝 ProN W3" w:eastAsia="ヒラギノ明朝 ProN W3" w:hAnsi="ヒラギノ明朝 ProN W3" w:hint="eastAsia"/>
+          <w:sz w:val="20"/>
+          <w:szCs w:val="20"/>
+        </w:rPr>
+        <w:t xml:space="preserve">　口座番号：</w:t>
+      </w:r>
+      <w:r>
+        <w:rPr>
+          <w:rFonts w:ascii="ヒラギノ明朝 ProN W3" w:eastAsia="ヒラギノ明朝 ProN W3" w:hAnsi="ヒラギノ明朝 ProN W3"/>
+          <w:sz w:val="20"/>
+          <w:szCs w:val="20"/>
+        </w:rPr>
+        <w:t>8301235</w:t>
+      </w:r>
+    </w:p>
+    <w:p>
+      <w:pPr>
+        <w:rPr>
+          <w:rFonts w:ascii="ヒラギノ明朝 ProN W3" w:eastAsia="ヒラギノ明朝 ProN W3" w:hAnsi="ヒラギノ明朝 ProN W3"/>
+          <w:sz w:val="20"/>
+          <w:szCs w:val="20"/>
+        </w:rPr>
+      </w:pPr>
+      <w:r>
+        <w:rPr>
+          <w:rFonts w:ascii="ヒラギノ明朝 ProN W3" w:eastAsia="ヒラギノ明朝 ProN W3" w:hAnsi="ヒラギノ明朝 ProN W3" w:hint="eastAsia"/>
+          <w:sz w:val="20"/>
+          <w:szCs w:val="20"/>
+        </w:rPr>
+        <w:t xml:space="preserve">　口座名義：</w:t>
+      </w:r>
+      <w:r>
+        <w:rPr>
+          <w:rFonts w:ascii="ヒラギノ明朝 ProN W3" w:eastAsia="ヒラギノ明朝 ProN W3" w:hAnsi="ヒラギノ明朝 ProN W3"/>
+          <w:sz w:val="20"/>
+          <w:szCs w:val="20"/>
+        </w:rPr>
+        <w:t>Shohei KIMURA（キムラショウヘイ）</w:t>
+      </w:r>
+    </w:p>
+    <w:p>
+      <w:pPr>
+        <w:rPr>
+          <w:rFonts w:ascii="ヒラギノ明朝 ProN W3" w:eastAsia="ヒラギノ明朝 ProN W3" w:hAnsi="ヒラギノ明朝 ProN W3"/>
+          <w:sz w:val="20"/>
+          <w:szCs w:val="20"/>
+        </w:rPr>
+      </w:pPr>
+    </w:p>
+    <w:p>
+      <w:pPr>
+        <w:rPr>
+          <w:rFonts w:ascii="ヒラギノ明朝 ProN W3" w:eastAsia="ヒラギノ明朝 ProN W3" w:hAnsi="ヒラギノ明朝 ProN W3"/>
+          <w:sz w:val="20"/>
+          <w:szCs w:val="20"/>
+        </w:rPr>
+      </w:pPr>
+      <w:r>
+        <w:rPr>
+          <w:rFonts w:ascii="ヒラギノ明朝 ProN W3" w:eastAsia="ヒラギノ明朝 ProN W3" w:hAnsi="ヒラギノ明朝 ProN W3"/>
+          <w:sz w:val="20"/>
+          <w:szCs w:val="20"/>
+        </w:rPr>
+        <w:t>Harvey Specter:</w:t>
+      </w:r>
+    </w:p>
+    <w:p>
+      <w:pPr>
+        <w:rPr>
+          <w:rFonts w:ascii="ヒラギノ明朝 ProN W3" w:eastAsia="ヒラギノ明朝 ProN W3" w:hAnsi="ヒラギノ明朝 ProN W3"/>
+          <w:sz w:val="20"/>
+          <w:szCs w:val="20"/>
+        </w:rPr>
+      </w:pPr>
+      <w:r>
+        <w:rPr>
+          <w:rFonts w:ascii="ヒラギノ明朝 ProN W3" w:eastAsia="ヒラギノ明朝 ProN W3" w:hAnsi="ヒラギノ明朝 ProN W3"/>
+          <w:sz w:val="20"/>
+          <w:szCs w:val="20"/>
+        </w:rPr>
+        <w:t>This is the payment landing zone. SMBC. Hachioji Branch. Ordinary deposit. The account number and the name are exactly as written. You wire it here; nowhere else counts as performance.</w:t>
+      </w:r>
+    </w:p>
+    <w:p>
+      <w:pPr>
+        <w:rPr>
+          <w:rFonts w:ascii="ヒラギノ明朝 ProN W3" w:eastAsia="ヒラギノ明朝 ProN W3" w:hAnsi="ヒラギノ明朝 ProN W3"/>
+          <w:sz w:val="20"/>
+          <w:szCs w:val="20"/>
+        </w:rPr>
+      </w:pPr>
+    </w:p>
+    <w:p>
+      <w:pPr>
+        <w:rPr>
+          <w:rFonts w:ascii="ヒラギノ明朝 ProN W3" w:eastAsia="ヒラギノ明朝 ProN W3" w:hAnsi="ヒラギノ明朝 ProN W3"/>
+          <w:sz w:val="20"/>
+          <w:szCs w:val="20"/>
+        </w:rPr>
+      </w:pPr>
+      <w:r>
+        <w:rPr>
+          <w:rFonts w:ascii="ヒラギノ明朝 ProN W3" w:eastAsia="ヒラギノ明朝 ProN W3" w:hAnsi="ヒラギノ明朝 ProN W3" w:hint="eastAsia"/>
+          <w:sz w:val="20"/>
+          <w:szCs w:val="20"/>
+        </w:rPr>
+        <w:t>第</w:t>
+      </w:r>
+      <w:r>
+        <w:rPr>
+          <w:rFonts w:ascii="ヒラギノ明朝 ProN W3" w:eastAsia="ヒラギノ明朝 ProN W3" w:hAnsi="ヒラギノ明朝 ProN W3"/>
+          <w:sz w:val="20"/>
+          <w:szCs w:val="20"/>
+        </w:rPr>
+        <w:t>2条（支払通貨及び為替基準）</w:t>
+      </w:r>
+    </w:p>
+    <w:p>
+      <w:pPr>
+        <w:rPr>
+          <w:rFonts w:ascii="ヒラギノ明朝 ProN W3" w:eastAsia="ヒラギノ明朝 ProN W3" w:hAnsi="ヒラギノ明朝 ProN W3"/>
+          <w:sz w:val="20"/>
+          <w:szCs w:val="20"/>
+        </w:rPr>
+      </w:pPr>
+      <w:r>
+        <w:rPr>
+          <w:rFonts w:ascii="ヒラギノ明朝 ProN W3" w:eastAsia="ヒラギノ明朝 ProN W3" w:hAnsi="ヒラギノ明朝 ProN W3"/>
+          <w:sz w:val="20"/>
+          <w:szCs w:val="20"/>
+        </w:rPr>
+        <w:t>1.</w:t>
       </w:r>
       <w:r>
         <w:rPr>
@@ -6436,41 +7384,89 @@
           <w:sz w:val="20"/>
           <w:szCs w:val="20"/>
         </w:rPr>
-        <w:t>前項に定めるアップロードは、当該Gitリポジトリに記録されるコミットハッシュ及びタイムスタンプにより</w:t>
-      </w:r>
-    </w:p>
-    <w:p>
-      <w:pPr>
-        <w:rPr>
-          <w:rFonts w:ascii="ヒラギノ明朝 ProN W3" w:eastAsia="ヒラギノ明朝 ProN W3" w:hAnsi="ヒラギノ明朝 ProN W3"/>
-          <w:sz w:val="20"/>
-          <w:szCs w:val="20"/>
-        </w:rPr>
-      </w:pPr>
-      <w:r>
-        <w:rPr>
-          <w:rFonts w:ascii="ヒラギノ明朝 ProN W3" w:eastAsia="ヒラギノ明朝 ProN W3" w:hAnsi="ヒラギノ明朝 ProN W3"/>
-          <w:sz w:val="20"/>
-          <w:szCs w:val="20"/>
-        </w:rPr>
-        <w:t>客観的に証明されるものとし、当事者は、これらが本契約及び別紙の効力発生時期に関する第一次的な証拠となる</w:t>
-      </w:r>
-    </w:p>
-    <w:p>
-      <w:pPr>
-        <w:rPr>
-          <w:rFonts w:ascii="ヒラギノ明朝 ProN W3" w:eastAsia="ヒラギノ明朝 ProN W3" w:hAnsi="ヒラギノ明朝 ProN W3"/>
-          <w:sz w:val="20"/>
-          <w:szCs w:val="20"/>
-        </w:rPr>
-      </w:pPr>
-      <w:r>
-        <w:rPr>
-          <w:rFonts w:ascii="ヒラギノ明朝 ProN W3" w:eastAsia="ヒラギノ明朝 ProN W3" w:hAnsi="ヒラギノ明朝 ProN W3"/>
-          <w:sz w:val="20"/>
-          <w:szCs w:val="20"/>
-        </w:rPr>
-        <w:t>ことに合意します。</w:t>
+        <w:t>支払通貨は原則としてUSDとする。</w:t>
+      </w:r>
+    </w:p>
+    <w:p>
+      <w:pPr>
+        <w:rPr>
+          <w:rFonts w:ascii="ヒラギノ明朝 ProN W3" w:eastAsia="ヒラギノ明朝 ProN W3" w:hAnsi="ヒラギノ明朝 ProN W3"/>
+          <w:sz w:val="20"/>
+          <w:szCs w:val="20"/>
+        </w:rPr>
+      </w:pPr>
+      <w:r>
+        <w:rPr>
+          <w:rFonts w:ascii="ヒラギノ明朝 ProN W3" w:eastAsia="ヒラギノ明朝 ProN W3" w:hAnsi="ヒラギノ明朝 ProN W3"/>
+          <w:sz w:val="20"/>
+          <w:szCs w:val="20"/>
+        </w:rPr>
+        <w:t>2.</w:t>
+      </w:r>
+      <w:r>
+        <w:rPr>
+          <w:rFonts w:ascii="ヒラギノ明朝 ProN W3" w:eastAsia="ヒラギノ明朝 ProN W3" w:hAnsi="ヒラギノ明朝 ProN W3"/>
+          <w:sz w:val="20"/>
+          <w:szCs w:val="20"/>
+        </w:rPr>
+        <w:t xml:space="preserve"> </w:t>
+      </w:r>
+      <w:r>
+        <w:rPr>
+          <w:rFonts w:ascii="ヒラギノ明朝 ProN W3" w:eastAsia="ヒラギノ明朝 ProN W3" w:hAnsi="ヒラギノ明朝 ProN W3"/>
+          <w:sz w:val="20"/>
+          <w:szCs w:val="20"/>
+        </w:rPr>
+        <w:t>日本国内居住者は円建て支払を行うことができる。</w:t>
+      </w:r>
+    </w:p>
+    <w:p>
+      <w:pPr>
+        <w:rPr>
+          <w:rFonts w:ascii="ヒラギノ明朝 ProN W3" w:eastAsia="ヒラギノ明朝 ProN W3" w:hAnsi="ヒラギノ明朝 ProN W3"/>
+          <w:sz w:val="20"/>
+          <w:szCs w:val="20"/>
+        </w:rPr>
+      </w:pPr>
+      <w:r>
+        <w:rPr>
+          <w:rFonts w:ascii="ヒラギノ明朝 ProN W3" w:eastAsia="ヒラギノ明朝 ProN W3" w:hAnsi="ヒラギノ明朝 ProN W3"/>
+          <w:sz w:val="20"/>
+          <w:szCs w:val="20"/>
+        </w:rPr>
+        <w:t>3.</w:t>
+      </w:r>
+      <w:r>
+        <w:rPr>
+          <w:rFonts w:ascii="ヒラギノ明朝 ProN W3" w:eastAsia="ヒラギノ明朝 ProN W3" w:hAnsi="ヒラギノ明朝 ProN W3"/>
+          <w:sz w:val="20"/>
+          <w:szCs w:val="20"/>
+        </w:rPr>
+        <w:t xml:space="preserve"> </w:t>
+      </w:r>
+      <w:r>
+        <w:rPr>
+          <w:rFonts w:ascii="ヒラギノ明朝 ProN W3" w:eastAsia="ヒラギノ明朝 ProN W3" w:hAnsi="ヒラギノ明朝 ProN W3"/>
+          <w:sz w:val="20"/>
+          <w:szCs w:val="20"/>
+        </w:rPr>
+        <w:t>円建額は「1 USD = 125 JPY」の固定レートに基づき、別紙記載の</w:t>
+      </w:r>
+      <w:r>
+        <w:rPr>
+          <w:rFonts w:ascii="ヒラギノ明朝 ProN W3" w:eastAsia="ヒラギノ明朝 ProN W3" w:hAnsi="ヒラギノ明朝 ProN W3" w:hint="eastAsia"/>
+          <w:sz w:val="20"/>
+          <w:szCs w:val="20"/>
+        </w:rPr>
+        <w:t>金額</w:t>
+      </w:r>
+      <w:r>
+        <w:rPr>
+          <w:rFonts w:ascii="ヒラギノ明朝 ProN W3" w:eastAsia="ヒラギノ明朝 ProN W3" w:hAnsi="ヒラギノ明朝 ProN W3"/>
+          <w:sz w:val="20"/>
+          <w:szCs w:val="20"/>
+        </w:rPr>
+        <w:t>以上でなければならない。</w:t>
       </w:r>
     </w:p>
     <w:p>
@@ -6513,33 +7509,7 @@
           <w:sz w:val="20"/>
           <w:szCs w:val="20"/>
         </w:rPr>
-        <w:t>The commit hash and timestamp in the repo are the time stamp. They are the primary evidence of when the contract took effect. You do not need a notary when you already have an immutable ledger.</w:t>
-      </w:r>
-    </w:p>
-    <w:p>
-      <w:pPr>
-        <w:rPr>
-          <w:rFonts w:ascii="ヒラギノ明朝 ProN W3" w:eastAsia="ヒラギノ明朝 ProN W3" w:hAnsi="ヒラギノ明朝 ProN W3"/>
-          <w:sz w:val="20"/>
-          <w:szCs w:val="20"/>
-        </w:rPr>
-      </w:pPr>
-    </w:p>
-    <w:p>
-      <w:pPr>
-        <w:rPr>
-          <w:rFonts w:ascii="ヒラギノ明朝 ProN W3" w:eastAsia="ヒラギノ明朝 ProN W3" w:hAnsi="ヒラギノ明朝 ProN W3"/>
-          <w:sz w:val="20"/>
-          <w:szCs w:val="20"/>
-        </w:rPr>
-      </w:pPr>
-      <w:r>
-        <w:rPr>
-          <w:rFonts w:ascii="ヒラギノ明朝 ProN W3" w:eastAsia="ヒラギノ明朝 ProN W3" w:hAnsi="ヒラギノ明朝 ProN W3"/>
-          <w:sz w:val="20"/>
-          <w:szCs w:val="20"/>
-        </w:rPr>
-        <w:t>5.</w:t>
+        <w:t>You pay in dollars by default.</w:t>
       </w:r>
       <w:r>
         <w:rPr>
@@ -6555,41 +7525,58 @@
           <w:sz w:val="20"/>
           <w:szCs w:val="20"/>
         </w:rPr>
-        <w:t>署名PDFがライセンサーの上記メールアドレスに到達したことのみをもっては、本契約及び別紙は効力を</w:t>
-      </w:r>
-    </w:p>
-    <w:p>
-      <w:pPr>
-        <w:rPr>
-          <w:rFonts w:ascii="ヒラギノ明朝 ProN W3" w:eastAsia="ヒラギノ明朝 ProN W3" w:hAnsi="ヒラギノ明朝 ProN W3"/>
-          <w:sz w:val="20"/>
-          <w:szCs w:val="20"/>
-        </w:rPr>
-      </w:pPr>
-      <w:r>
-        <w:rPr>
-          <w:rFonts w:ascii="ヒラギノ明朝 ProN W3" w:eastAsia="ヒラギノ明朝 ProN W3" w:hAnsi="ヒラギノ明朝 ProN W3"/>
-          <w:sz w:val="20"/>
-          <w:szCs w:val="20"/>
-        </w:rPr>
-        <w:t>生じないものとします。ライセンサーは、署名PDFを受領した後であっても、これをアップロードしない自由を</w:t>
-      </w:r>
-    </w:p>
-    <w:p>
-      <w:pPr>
-        <w:rPr>
-          <w:rFonts w:ascii="ヒラギノ明朝 ProN W3" w:eastAsia="ヒラギノ明朝 ProN W3" w:hAnsi="ヒラギノ明朝 ProN W3"/>
-          <w:sz w:val="20"/>
-          <w:szCs w:val="20"/>
-        </w:rPr>
-      </w:pPr>
-      <w:r>
-        <w:rPr>
-          <w:rFonts w:ascii="ヒラギノ明朝 ProN W3" w:eastAsia="ヒラギノ明朝 ProN W3" w:hAnsi="ヒラギノ明朝 ProN W3"/>
-          <w:sz w:val="20"/>
-          <w:szCs w:val="20"/>
-        </w:rPr>
-        <w:t>留保し、アップロードを行わない場合には、本契約は成立しないことにつき、ライセンシーはあらかじめ承諾します。</w:t>
+        <w:t>If you’re in Japan, you’re allowed to pay in yen — but at a fixed 125-to-1 rate, and you pay at least the USD equivalent. No FX tricks. No “today’s rate is lower” arguments. Fixed means fixed.</w:t>
+      </w:r>
+    </w:p>
+    <w:p>
+      <w:pPr>
+        <w:rPr>
+          <w:rFonts w:ascii="ヒラギノ明朝 ProN W3" w:eastAsia="ヒラギノ明朝 ProN W3" w:hAnsi="ヒラギノ明朝 ProN W3"/>
+          <w:sz w:val="20"/>
+          <w:szCs w:val="20"/>
+        </w:rPr>
+      </w:pPr>
+    </w:p>
+    <w:p>
+      <w:pPr>
+        <w:rPr>
+          <w:rFonts w:ascii="ヒラギノ明朝 ProN W3" w:eastAsia="ヒラギノ明朝 ProN W3" w:hAnsi="ヒラギノ明朝 ProN W3"/>
+          <w:sz w:val="20"/>
+          <w:szCs w:val="20"/>
+        </w:rPr>
+      </w:pPr>
+      <w:r>
+        <w:rPr>
+          <w:rFonts w:ascii="ヒラギノ明朝 ProN W3" w:eastAsia="ヒラギノ明朝 ProN W3" w:hAnsi="ヒラギノ明朝 ProN W3" w:hint="eastAsia"/>
+          <w:sz w:val="20"/>
+          <w:szCs w:val="20"/>
+        </w:rPr>
+        <w:t>第</w:t>
+      </w:r>
+      <w:r>
+        <w:rPr>
+          <w:rFonts w:ascii="ヒラギノ明朝 ProN W3" w:eastAsia="ヒラギノ明朝 ProN W3" w:hAnsi="ヒラギノ明朝 ProN W3"/>
+          <w:sz w:val="20"/>
+          <w:szCs w:val="20"/>
+        </w:rPr>
+        <w:t>3条（手数料負担）</w:t>
+      </w:r>
+    </w:p>
+    <w:p>
+      <w:pPr>
+        <w:rPr>
+          <w:rFonts w:ascii="ヒラギノ明朝 ProN W3" w:eastAsia="ヒラギノ明朝 ProN W3" w:hAnsi="ヒラギノ明朝 ProN W3"/>
+          <w:sz w:val="20"/>
+          <w:szCs w:val="20"/>
+        </w:rPr>
+      </w:pPr>
+      <w:r>
+        <w:rPr>
+          <w:rFonts w:ascii="ヒラギノ明朝 ProN W3" w:eastAsia="ヒラギノ明朝 ProN W3" w:hAnsi="ヒラギノ明朝 ProN W3" w:hint="eastAsia"/>
+          <w:sz w:val="20"/>
+          <w:szCs w:val="20"/>
+        </w:rPr>
+        <w:t>送金手数料・為替手数料その他の支払関連費用は、すべてライセンシーの負担とする。</w:t>
       </w:r>
     </w:p>
     <w:p>
@@ -6632,83 +7619,94 @@
           <w:sz w:val="20"/>
           <w:szCs w:val="20"/>
         </w:rPr>
-        <w:t>Just sending the signed PDF does not bind Kimura. He keeps the right to walk away by simply not uploading it. No upload, no contract. That asymmetry is intentional — like a bearer bond that only becomes live when it is actually lodged in the vault.</w:t>
-      </w:r>
-    </w:p>
-    <w:p>
-      <w:pPr>
-        <w:rPr>
-          <w:rFonts w:ascii="ヒラギノ明朝 ProN W3" w:eastAsia="ヒラギノ明朝 ProN W3" w:hAnsi="ヒラギノ明朝 ProN W3"/>
-          <w:sz w:val="20"/>
-          <w:szCs w:val="20"/>
-        </w:rPr>
-      </w:pPr>
-    </w:p>
-    <w:p>
-      <w:pPr>
-        <w:rPr>
-          <w:rFonts w:ascii="ヒラギノ明朝 ProN W3" w:eastAsia="ヒラギノ明朝 ProN W3" w:hAnsi="ヒラギノ明朝 ProN W3"/>
-          <w:sz w:val="20"/>
-          <w:szCs w:val="20"/>
-        </w:rPr>
-      </w:pPr>
-      <w:r>
-        <w:rPr>
-          <w:rFonts w:ascii="ヒラギノ明朝 ProN W3" w:eastAsia="ヒラギノ明朝 ProN W3" w:hAnsi="ヒラギノ明朝 ProN W3"/>
-          <w:sz w:val="20"/>
-          <w:szCs w:val="20"/>
-        </w:rPr>
-        <w:t>6.</w:t>
-      </w:r>
-      <w:r>
-        <w:rPr>
-          <w:rFonts w:ascii="ヒラギノ明朝 ProN W3" w:eastAsia="ヒラギノ明朝 ProN W3" w:hAnsi="ヒラギノ明朝 ProN W3"/>
-          <w:sz w:val="20"/>
-          <w:szCs w:val="20"/>
-        </w:rPr>
-        <w:t xml:space="preserve"> </w:t>
-      </w:r>
-      <w:r>
-        <w:rPr>
-          <w:rFonts w:ascii="ヒラギノ明朝 ProN W3" w:eastAsia="ヒラギノ明朝 ProN W3" w:hAnsi="ヒラギノ明朝 ProN W3"/>
-          <w:sz w:val="20"/>
-          <w:szCs w:val="20"/>
-        </w:rPr>
-        <w:t>ライセンシーは、上記手続に従って送付される署名PDF以外の電子メール、添付ファイル又は通信手段について、ライセンサーが本契約又は別紙に関する正式な申込み若しくは承諾として取り扱う義務を負わないことを承諾し、</w:t>
-      </w:r>
-    </w:p>
-    <w:p>
-      <w:pPr>
-        <w:rPr>
-          <w:rFonts w:ascii="ヒラギノ明朝 ProN W3" w:eastAsia="ヒラギノ明朝 ProN W3" w:hAnsi="ヒラギノ明朝 ProN W3"/>
-          <w:sz w:val="20"/>
-          <w:szCs w:val="20"/>
-        </w:rPr>
-      </w:pPr>
-      <w:r>
-        <w:rPr>
-          <w:rFonts w:ascii="ヒラギノ明朝 ProN W3" w:eastAsia="ヒラギノ明朝 ProN W3" w:hAnsi="ヒラギノ明朝 ProN W3"/>
-          <w:sz w:val="20"/>
-          <w:szCs w:val="20"/>
-        </w:rPr>
-        <w:t>ライセンシー側の内部処理上の誤送信又は件名誤記等を理由として、本契約の成立又は効力発生を主張しないもの</w:t>
-      </w:r>
-    </w:p>
-    <w:p>
-      <w:pPr>
-        <w:rPr>
-          <w:rFonts w:ascii="ヒラギノ明朝 ProN W3" w:eastAsia="ヒラギノ明朝 ProN W3" w:hAnsi="ヒラギノ明朝 ProN W3"/>
-          <w:sz w:val="20"/>
-          <w:szCs w:val="20"/>
-        </w:rPr>
-      </w:pPr>
-      <w:r>
-        <w:rPr>
-          <w:rFonts w:ascii="ヒラギノ明朝 ProN W3" w:eastAsia="ヒラギノ明朝 ProN W3" w:hAnsi="ヒラギノ明朝 ProN W3"/>
-          <w:sz w:val="20"/>
-          <w:szCs w:val="20"/>
-        </w:rPr>
-        <w:t>とします。</w:t>
+        <w:t>Every fee is yours. Bank fees, wire fees, FX fees — all of it. Kimura receives the full amount, not whatever is left after your bank takes its cut.</w:t>
+      </w:r>
+    </w:p>
+    <w:p>
+      <w:pPr>
+        <w:rPr>
+          <w:rFonts w:ascii="ヒラギノ明朝 ProN W3" w:eastAsia="ヒラギノ明朝 ProN W3" w:hAnsi="ヒラギノ明朝 ProN W3"/>
+          <w:sz w:val="20"/>
+          <w:szCs w:val="20"/>
+        </w:rPr>
+      </w:pPr>
+    </w:p>
+    <w:p>
+      <w:pPr>
+        <w:rPr>
+          <w:rFonts w:ascii="ヒラギノ明朝 ProN W3" w:eastAsia="ヒラギノ明朝 ProN W3" w:hAnsi="ヒラギノ明朝 ProN W3"/>
+          <w:sz w:val="20"/>
+          <w:szCs w:val="20"/>
+        </w:rPr>
+      </w:pPr>
+    </w:p>
+    <w:p>
+      <w:pPr>
+        <w:rPr>
+          <w:rFonts w:ascii="ヒラギノ明朝 ProN W3" w:eastAsia="ヒラギノ明朝 ProN W3" w:hAnsi="ヒラギノ明朝 ProN W3"/>
+          <w:sz w:val="20"/>
+          <w:szCs w:val="20"/>
+        </w:rPr>
+      </w:pPr>
+    </w:p>
+    <w:p>
+      <w:pPr>
+        <w:rPr>
+          <w:rFonts w:ascii="ヒラギノ明朝 ProN W3" w:eastAsia="ヒラギノ明朝 ProN W3" w:hAnsi="ヒラギノ明朝 ProN W3"/>
+          <w:sz w:val="20"/>
+          <w:szCs w:val="20"/>
+        </w:rPr>
+      </w:pPr>
+    </w:p>
+    <w:p>
+      <w:pPr>
+        <w:rPr>
+          <w:rFonts w:ascii="ヒラギノ明朝 ProN W3" w:eastAsia="ヒラギノ明朝 ProN W3" w:hAnsi="ヒラギノ明朝 ProN W3"/>
+          <w:sz w:val="20"/>
+          <w:szCs w:val="20"/>
+        </w:rPr>
+      </w:pPr>
+      <w:r>
+        <w:rPr>
+          <w:rFonts w:ascii="ヒラギノ明朝 ProN W3" w:eastAsia="ヒラギノ明朝 ProN W3" w:hAnsi="ヒラギノ明朝 ProN W3" w:hint="eastAsia"/>
+          <w:sz w:val="20"/>
+          <w:szCs w:val="20"/>
+        </w:rPr>
+        <w:lastRenderedPageBreak/>
+        <w:t>第</w:t>
+      </w:r>
+      <w:r>
+        <w:rPr>
+          <w:rFonts w:ascii="ヒラギノ明朝 ProN W3" w:eastAsia="ヒラギノ明朝 ProN W3" w:hAnsi="ヒラギノ明朝 ProN W3"/>
+          <w:sz w:val="20"/>
+          <w:szCs w:val="20"/>
+        </w:rPr>
+        <w:t>4条（支払期限の遵守）</w:t>
+      </w:r>
+    </w:p>
+    <w:p>
+      <w:pPr>
+        <w:rPr>
+          <w:rFonts w:ascii="ヒラギノ明朝 ProN W3" w:eastAsia="ヒラギノ明朝 ProN W3" w:hAnsi="ヒラギノ明朝 ProN W3"/>
+          <w:sz w:val="20"/>
+          <w:szCs w:val="20"/>
+        </w:rPr>
+      </w:pPr>
+      <w:r>
+        <w:rPr>
+          <w:rFonts w:ascii="ヒラギノ明朝 ProN W3" w:eastAsia="ヒラギノ明朝 ProN W3" w:hAnsi="ヒラギノ明朝 ProN W3" w:hint="eastAsia"/>
+          <w:sz w:val="20"/>
+          <w:szCs w:val="20"/>
+        </w:rPr>
+        <w:t>支払は、別紙及びマスター契約第</w:t>
+      </w:r>
+      <w:r>
+        <w:rPr>
+          <w:rFonts w:ascii="ヒラギノ明朝 ProN W3" w:eastAsia="ヒラギノ明朝 ProN W3" w:hAnsi="ヒラギノ明朝 ProN W3"/>
+          <w:sz w:val="20"/>
+          <w:szCs w:val="20"/>
+        </w:rPr>
+        <w:t>5条に定める支払期日までに、上記口座に着金するよう行わなければならない。</w:t>
       </w:r>
     </w:p>
     <w:p>
@@ -6740,18 +7738,251 @@
     <w:p>
       <w:pPr>
         <w:rPr>
+          <w:rFonts w:ascii="ヒラギノ明朝 ProN W3" w:eastAsia="ヒラギノ明朝 ProN W3" w:hAnsi="ヒラギノ明朝 ProN W3"/>
+          <w:sz w:val="20"/>
+          <w:szCs w:val="20"/>
+        </w:rPr>
+      </w:pPr>
+      <w:r>
+        <w:rPr>
+          <w:rFonts w:ascii="ヒラギノ明朝 ProN W3" w:eastAsia="ヒラギノ明朝 ProN W3" w:hAnsi="ヒラギノ明朝 ProN W3"/>
+          <w:sz w:val="20"/>
+          <w:szCs w:val="20"/>
+        </w:rPr>
+        <w:t>Payment isn’t made when you hit “send.” It is made when the money arrives. If it hits the account late, you paid late. And the consequences follow.</w:t>
+      </w:r>
+    </w:p>
+    <w:p>
+      <w:pPr>
+        <w:rPr>
+          <w:rFonts w:ascii="ヒラギノ明朝 ProN W3" w:eastAsia="ヒラギノ明朝 ProN W3" w:hAnsi="ヒラギノ明朝 ProN W3"/>
+          <w:sz w:val="20"/>
+          <w:szCs w:val="20"/>
+        </w:rPr>
+      </w:pPr>
+    </w:p>
+    <w:p>
+      <w:pPr>
+        <w:rPr>
+          <w:rFonts w:ascii="ヒラギノ明朝 ProN W3" w:eastAsia="ヒラギノ明朝 ProN W3" w:hAnsi="ヒラギノ明朝 ProN W3"/>
+          <w:sz w:val="20"/>
+          <w:szCs w:val="20"/>
+          <w:lang w:eastAsia="zh-TW"/>
+        </w:rPr>
+      </w:pPr>
+      <w:r>
+        <w:rPr>
           <w:rFonts w:ascii="ヒラギノ明朝 ProN W3" w:eastAsia="ヒラギノ明朝 ProN W3" w:hAnsi="ヒラギノ明朝 ProN W3" w:hint="eastAsia"/>
           <w:sz w:val="20"/>
           <w:szCs w:val="20"/>
-        </w:rPr>
-      </w:pPr>
-      <w:r>
-        <w:rPr>
-          <w:rFonts w:ascii="ヒラギノ明朝 ProN W3" w:eastAsia="ヒラギノ明朝 ProN W3" w:hAnsi="ヒラギノ明朝 ProN W3"/>
-          <w:sz w:val="20"/>
-          <w:szCs w:val="20"/>
-        </w:rPr>
-        <w:t>If you mis-send, mistype the subject, or route it through another channel, that is on you. You cannot later claim “but we intended to contract.” Intent without the prescribed procedure does not create this deal.</w:t>
+          <w:lang w:eastAsia="zh-TW"/>
+        </w:rPr>
+        <w:t>第</w:t>
+      </w:r>
+      <w:r>
+        <w:rPr>
+          <w:rFonts w:ascii="ヒラギノ明朝 ProN W3" w:eastAsia="ヒラギノ明朝 ProN W3" w:hAnsi="ヒラギノ明朝 ProN W3"/>
+          <w:sz w:val="20"/>
+          <w:szCs w:val="20"/>
+          <w:lang w:eastAsia="zh-TW"/>
+        </w:rPr>
+        <w:t>5条（企業内記録義務）</w:t>
+      </w:r>
+    </w:p>
+    <w:p>
+      <w:pPr>
+        <w:rPr>
+          <w:rFonts w:ascii="ヒラギノ明朝 ProN W3" w:eastAsia="ヒラギノ明朝 ProN W3" w:hAnsi="ヒラギノ明朝 ProN W3"/>
+          <w:sz w:val="20"/>
+          <w:szCs w:val="20"/>
+        </w:rPr>
+      </w:pPr>
+      <w:r>
+        <w:rPr>
+          <w:rFonts w:ascii="ヒラギノ明朝 ProN W3" w:eastAsia="ヒラギノ明朝 ProN W3" w:hAnsi="ヒラギノ明朝 ProN W3" w:hint="eastAsia"/>
+          <w:sz w:val="20"/>
+          <w:szCs w:val="20"/>
+        </w:rPr>
+        <w:t>ライセンシーは、支払完了後、当該支払に係る社内記録を保持し、必要に応じて米国証券取引法等に基づく</w:t>
+      </w:r>
+    </w:p>
+    <w:p>
+      <w:pPr>
+        <w:rPr>
+          <w:rFonts w:ascii="ヒラギノ明朝 ProN W3" w:eastAsia="ヒラギノ明朝 ProN W3" w:hAnsi="ヒラギノ明朝 ProN W3"/>
+          <w:sz w:val="20"/>
+          <w:szCs w:val="20"/>
+        </w:rPr>
+      </w:pPr>
+      <w:r>
+        <w:rPr>
+          <w:rFonts w:ascii="ヒラギノ明朝 ProN W3" w:eastAsia="ヒラギノ明朝 ProN W3" w:hAnsi="ヒラギノ明朝 ProN W3" w:hint="eastAsia"/>
+          <w:sz w:val="20"/>
+          <w:szCs w:val="20"/>
+        </w:rPr>
+        <w:t>コンプライアンス要件に従い整理するものとする。</w:t>
+      </w:r>
+    </w:p>
+    <w:p>
+      <w:pPr>
+        <w:rPr>
+          <w:rFonts w:ascii="ヒラギノ明朝 ProN W3" w:eastAsia="ヒラギノ明朝 ProN W3" w:hAnsi="ヒラギノ明朝 ProN W3"/>
+          <w:sz w:val="20"/>
+          <w:szCs w:val="20"/>
+        </w:rPr>
+      </w:pPr>
+    </w:p>
+    <w:p>
+      <w:pPr>
+        <w:rPr>
+          <w:rFonts w:ascii="ヒラギノ明朝 ProN W3" w:eastAsia="ヒラギノ明朝 ProN W3" w:hAnsi="ヒラギノ明朝 ProN W3"/>
+          <w:sz w:val="20"/>
+          <w:szCs w:val="20"/>
+        </w:rPr>
+      </w:pPr>
+      <w:r>
+        <w:rPr>
+          <w:rFonts w:ascii="ヒラギノ明朝 ProN W3" w:eastAsia="ヒラギノ明朝 ProN W3" w:hAnsi="ヒラギノ明朝 ProN W3"/>
+          <w:sz w:val="20"/>
+          <w:szCs w:val="20"/>
+        </w:rPr>
+        <w:t>Harvey Specter:</w:t>
+      </w:r>
+    </w:p>
+    <w:p>
+      <w:pPr>
+        <w:rPr>
+          <w:rFonts w:ascii="ヒラギノ明朝 ProN W3" w:eastAsia="ヒラギノ明朝 ProN W3" w:hAnsi="ヒラギノ明朝 ProN W3"/>
+          <w:sz w:val="20"/>
+          <w:szCs w:val="20"/>
+        </w:rPr>
+      </w:pPr>
+      <w:r>
+        <w:rPr>
+          <w:rFonts w:ascii="ヒラギノ明朝 ProN W3" w:eastAsia="ヒラギノ明朝 ProN W3" w:hAnsi="ヒラギノ明朝 ProN W3"/>
+          <w:sz w:val="20"/>
+          <w:szCs w:val="20"/>
+        </w:rPr>
+        <w:t>Once you pay, you document it. If you’re a U.S. listed company, that means SEC records — Items 105 and 303. This clause makes that obligation explicit.</w:t>
+      </w:r>
+    </w:p>
+    <w:p>
+      <w:pPr>
+        <w:rPr>
+          <w:rFonts w:ascii="ヒラギノ明朝 ProN W3" w:eastAsia="ヒラギノ明朝 ProN W3" w:hAnsi="ヒラギノ明朝 ProN W3"/>
+          <w:sz w:val="20"/>
+          <w:szCs w:val="20"/>
+        </w:rPr>
+      </w:pPr>
+    </w:p>
+    <w:p>
+      <w:pPr>
+        <w:rPr>
+          <w:rFonts w:ascii="ヒラギノ明朝 ProN W3" w:eastAsia="ヒラギノ明朝 ProN W3" w:hAnsi="ヒラギノ明朝 ProN W3"/>
+          <w:sz w:val="20"/>
+          <w:szCs w:val="20"/>
+        </w:rPr>
+      </w:pPr>
+      <w:r>
+        <w:rPr>
+          <w:rFonts w:ascii="ヒラギノ明朝 ProN W3" w:eastAsia="ヒラギノ明朝 ProN W3" w:hAnsi="ヒラギノ明朝 ProN W3" w:hint="eastAsia"/>
+          <w:sz w:val="20"/>
+          <w:szCs w:val="20"/>
+        </w:rPr>
+        <w:t>第</w:t>
+      </w:r>
+      <w:r>
+        <w:rPr>
+          <w:rFonts w:ascii="ヒラギノ明朝 ProN W3" w:eastAsia="ヒラギノ明朝 ProN W3" w:hAnsi="ヒラギノ明朝 ProN W3"/>
+          <w:sz w:val="20"/>
+          <w:szCs w:val="20"/>
+        </w:rPr>
+        <w:t>6条（遅延・不履行の効果）</w:t>
+      </w:r>
+    </w:p>
+    <w:p>
+      <w:pPr>
+        <w:rPr>
+          <w:rFonts w:ascii="ヒラギノ明朝 ProN W3" w:eastAsia="ヒラギノ明朝 ProN W3" w:hAnsi="ヒラギノ明朝 ProN W3"/>
+          <w:sz w:val="20"/>
+          <w:szCs w:val="20"/>
+        </w:rPr>
+      </w:pPr>
+      <w:r>
+        <w:rPr>
+          <w:rFonts w:ascii="ヒラギノ明朝 ProN W3" w:eastAsia="ヒラギノ明朝 ProN W3" w:hAnsi="ヒラギノ明朝 ProN W3" w:hint="eastAsia"/>
+          <w:sz w:val="20"/>
+          <w:szCs w:val="20"/>
+        </w:rPr>
+        <w:t>支払遅延その他の不履行がある場合、本契約及び別紙に定める遅延損害金の対象となり、また</w:t>
+      </w:r>
+      <w:r>
+        <w:rPr>
+          <w:rFonts w:ascii="ヒラギノ明朝 ProN W3" w:eastAsia="ヒラギノ明朝 ProN W3" w:hAnsi="ヒラギノ明朝 ProN W3"/>
+          <w:sz w:val="20"/>
+          <w:szCs w:val="20"/>
+        </w:rPr>
+        <w:t>SEC関連規制上の</w:t>
+      </w:r>
+    </w:p>
+    <w:p>
+      <w:pPr>
+        <w:rPr>
+          <w:rFonts w:ascii="ヒラギノ明朝 ProN W3" w:eastAsia="ヒラギノ明朝 ProN W3" w:hAnsi="ヒラギノ明朝 ProN W3"/>
+          <w:sz w:val="20"/>
+          <w:szCs w:val="20"/>
+        </w:rPr>
+      </w:pPr>
+      <w:r>
+        <w:rPr>
+          <w:rFonts w:ascii="ヒラギノ明朝 ProN W3" w:eastAsia="ヒラギノ明朝 ProN W3" w:hAnsi="ヒラギノ明朝 ProN W3"/>
+          <w:sz w:val="20"/>
+          <w:szCs w:val="20"/>
+        </w:rPr>
+        <w:t>「重大事象（material event）」が発生し得る。</w:t>
+      </w:r>
+    </w:p>
+    <w:p>
+      <w:pPr>
+        <w:rPr>
+          <w:rFonts w:ascii="ヒラギノ明朝 ProN W3" w:eastAsia="ヒラギノ明朝 ProN W3" w:hAnsi="ヒラギノ明朝 ProN W3"/>
+          <w:sz w:val="20"/>
+          <w:szCs w:val="20"/>
+        </w:rPr>
+      </w:pPr>
+    </w:p>
+    <w:p>
+      <w:pPr>
+        <w:rPr>
+          <w:rFonts w:ascii="ヒラギノ明朝 ProN W3" w:eastAsia="ヒラギノ明朝 ProN W3" w:hAnsi="ヒラギノ明朝 ProN W3"/>
+          <w:sz w:val="20"/>
+          <w:szCs w:val="20"/>
+        </w:rPr>
+      </w:pPr>
+      <w:r>
+        <w:rPr>
+          <w:rFonts w:ascii="ヒラギノ明朝 ProN W3" w:eastAsia="ヒラギノ明朝 ProN W3" w:hAnsi="ヒラギノ明朝 ProN W3"/>
+          <w:sz w:val="20"/>
+          <w:szCs w:val="20"/>
+        </w:rPr>
+        <w:t>Harvey Specter:</w:t>
+      </w:r>
+    </w:p>
+    <w:p>
+      <w:pPr>
+        <w:rPr>
+          <w:rFonts w:ascii="ヒラギノ明朝 ProN W3" w:eastAsia="ヒラギノ明朝 ProN W3" w:hAnsi="ヒラギノ明朝 ProN W3" w:hint="eastAsia"/>
+          <w:sz w:val="20"/>
+          <w:szCs w:val="20"/>
+        </w:rPr>
+      </w:pPr>
+      <w:r>
+        <w:rPr>
+          <w:rFonts w:ascii="ヒラギノ明朝 ProN W3" w:eastAsia="ヒラギノ明朝 ProN W3" w:hAnsi="ヒラギノ明朝 ProN W3"/>
+          <w:sz w:val="20"/>
+          <w:szCs w:val="20"/>
+        </w:rPr>
+        <w:t>If you’re late, you owe interest. And if you’re a large corporation, you may have just created a reportable event. That is not small. Treat deadlines as real.</w:t>
       </w:r>
     </w:p>
     <w:sectPr>

</xml_diff>

<commit_message>
Slightly revised the entire contract
</commit_message>
<xml_diff>
--- a/1. AGREEMENT/1. General-Purpose Contract/1 Master Agreement for License of the Thought Formalization Procedure Right and the Complete Definition System.docx
+++ b/1. AGREEMENT/1. General-Purpose Contract/1 Master Agreement for License of the Thought Formalization Procedure Right and the Complete Definition System.docx
@@ -298,7 +298,7 @@
           <w:sz w:val="20"/>
           <w:szCs w:val="20"/>
         </w:rPr>
-        <w:t>1. 本契約は、OpenAI, L.L.C. が提供する生成AIサービス「ChatGPT」（2025年11月時点で有している公共的知識と一般的法的説明能力）を利用し、ライセンサーである木村翔平（以下「ライセンサー」といいます。）が当該AIの</w:t>
+        <w:t>1. 本契約は、OpenAI, L.L.C.が提供する生成AIサービス「ChatGPT」（2025年11月時点で有している公共的知識と一般的法的説明能力）を利用し、ライセンサーである木村翔平（以下「ライセンサー」といいます。）が当該AIの</w:t>
       </w:r>
     </w:p>
     <w:p>
@@ -969,7 +969,23 @@
           <w:szCs w:val="20"/>
         </w:rPr>
         <w:lastRenderedPageBreak/>
-        <w:t>3. 「思想形式化手続き権」とは、ライセンサーが「定義.txt」その他の定義文等において表現した、思想に形式を</w:t>
+        <w:t>3. 「思想形式化手続き権」とは、ライセンサーが「定義.</w:t>
+      </w:r>
+      <w:r>
+        <w:rPr>
+          <w:rFonts w:ascii="ヒラギノ明朝 ProN W3" w:eastAsia="ヒラギノ明朝 ProN W3" w:hAnsi="ヒラギノ明朝 ProN W3"/>
+          <w:sz w:val="20"/>
+          <w:szCs w:val="20"/>
+        </w:rPr>
+        <w:t>md</w:t>
+      </w:r>
+      <w:r>
+        <w:rPr>
+          <w:rFonts w:ascii="ヒラギノ明朝 ProN W3" w:eastAsia="ヒラギノ明朝 ProN W3" w:hAnsi="ヒラギノ明朝 ProN W3"/>
+          <w:sz w:val="20"/>
+          <w:szCs w:val="20"/>
+        </w:rPr>
+        <w:t>」その他の定義文等において表現した、思想に形式を</w:t>
       </w:r>
     </w:p>
     <w:p>
@@ -2055,7 +2071,7 @@
           <w:szCs w:val="20"/>
         </w:rPr>
         <w:lastRenderedPageBreak/>
-        <w:t>3. 支払遅延が生じた場合、ライセンシーは別紙に定める遅延損害金率に従い、支払期日の翌日から完済に至るまでの期間について遅延損害金を支払うものとします。</w:t>
+        <w:t>3. 支払遅延が生じた場合、ライセンシーは年率10％に従い、支払期日の翌日から完済に至るまでの期間について遅延損害金を支払うものとします。</w:t>
       </w:r>
     </w:p>
     <w:p>
@@ -2098,7 +2114,7 @@
           <w:sz w:val="20"/>
           <w:szCs w:val="20"/>
         </w:rPr>
-        <w:t>If you pay late, you pay interest at the rate set in the annex, from the day after the due date until the money actually lands.</w:t>
+        <w:t>If you pay late, you pay interest at an annual rate of 10 percent, from the day after the due date until the money actually lands.</w:t>
       </w:r>
     </w:p>
     <w:p>
@@ -4145,7 +4161,7 @@
           <w:sz w:val="20"/>
           <w:szCs w:val="20"/>
         </w:rPr>
-        <w:t>1. 本契約は、日本語条文と英語による解説的条文（Harvey Specter による説明）から構成されます。両者の間に</w:t>
+        <w:t>1. 本契約は、日本語条文と英語による解説的条文（Harvey Specterによる説明）から構成されます。両者の間に</w:t>
       </w:r>
     </w:p>
     <w:p>
@@ -4532,7 +4548,7 @@
           <w:sz w:val="20"/>
           <w:szCs w:val="20"/>
         </w:rPr>
-        <w:t xml:space="preserve">から22時の間に、SMS送信先番号 +81-70-3666-0022 に対し、「I hope take </w:t>
+        <w:t xml:space="preserve">から22時の間に、SMS送信先番号+81-70-3666-0022に対し、「I hope take </w:t>
       </w:r>
       <w:r>
         <w:rPr>
@@ -4983,7 +4999,7 @@
           <w:sz w:val="20"/>
           <w:szCs w:val="20"/>
         </w:rPr>
-        <w:t>- do と does の違いを正確に運用することが困難である場合があること</w:t>
+        <w:t>- doとdoesの違いを正確に運用することが困難である場合があること</w:t>
       </w:r>
     </w:p>
     <w:p>
@@ -5083,7 +5099,7 @@
           <w:sz w:val="20"/>
           <w:szCs w:val="20"/>
         </w:rPr>
-        <w:t>口頭コミュニケーション能力は CEFR A0</w:t>
+        <w:t>口頭コミュニケーション能力はCEFR A0</w:t>
       </w:r>
       <w:r>
         <w:rPr>
@@ -5099,7 +5115,7 @@
           <w:sz w:val="20"/>
           <w:szCs w:val="20"/>
         </w:rPr>
-        <w:t>A1 相当またはそれ以下であること</w:t>
+        <w:t>A1相当またはそれ以下であること</w:t>
       </w:r>
     </w:p>
     <w:p>
@@ -5306,33 +5322,33 @@
           <w:sz w:val="20"/>
           <w:szCs w:val="20"/>
         </w:rPr>
-        <w:t>第14条（ChatGPT 起案に関する特則）</w:t>
-      </w:r>
-    </w:p>
-    <w:p>
-      <w:pPr>
-        <w:rPr>
-          <w:rFonts w:ascii="ヒラギノ明朝 ProN W3" w:eastAsia="ヒラギノ明朝 ProN W3" w:hAnsi="ヒラギノ明朝 ProN W3"/>
-          <w:sz w:val="20"/>
-          <w:szCs w:val="20"/>
-        </w:rPr>
-      </w:pPr>
-    </w:p>
-    <w:p>
-      <w:pPr>
-        <w:rPr>
-          <w:rFonts w:ascii="ヒラギノ明朝 ProN W3" w:eastAsia="ヒラギノ明朝 ProN W3" w:hAnsi="ヒラギノ明朝 ProN W3"/>
-          <w:sz w:val="20"/>
-          <w:szCs w:val="20"/>
-        </w:rPr>
-      </w:pPr>
-      <w:r>
-        <w:rPr>
-          <w:rFonts w:ascii="ヒラギノ明朝 ProN W3" w:eastAsia="ヒラギノ明朝 ProN W3" w:hAnsi="ヒラギノ明朝 ProN W3"/>
-          <w:sz w:val="20"/>
-          <w:szCs w:val="20"/>
-        </w:rPr>
-        <w:t>1. 当事者は、本契約が ChatGPT による起案を基礎とすることから、将来の法改正、判例の変遷、AIに関する規制の変更等により、本契約条項のうち一部が想定外の評価を受ける可能性があることを理解し、その場合には信義則に</w:t>
+        <w:t>第14条（ChatGPT起案に関する特則）</w:t>
+      </w:r>
+    </w:p>
+    <w:p>
+      <w:pPr>
+        <w:rPr>
+          <w:rFonts w:ascii="ヒラギノ明朝 ProN W3" w:eastAsia="ヒラギノ明朝 ProN W3" w:hAnsi="ヒラギノ明朝 ProN W3"/>
+          <w:sz w:val="20"/>
+          <w:szCs w:val="20"/>
+        </w:rPr>
+      </w:pPr>
+    </w:p>
+    <w:p>
+      <w:pPr>
+        <w:rPr>
+          <w:rFonts w:ascii="ヒラギノ明朝 ProN W3" w:eastAsia="ヒラギノ明朝 ProN W3" w:hAnsi="ヒラギノ明朝 ProN W3"/>
+          <w:sz w:val="20"/>
+          <w:szCs w:val="20"/>
+        </w:rPr>
+      </w:pPr>
+      <w:r>
+        <w:rPr>
+          <w:rFonts w:ascii="ヒラギノ明朝 ProN W3" w:eastAsia="ヒラギノ明朝 ProN W3" w:hAnsi="ヒラギノ明朝 ProN W3"/>
+          <w:sz w:val="20"/>
+          <w:szCs w:val="20"/>
+        </w:rPr>
+        <w:t>1. 当事者は、本契約がChatGPTによる起案を基礎とすることから、将来の法改正、判例の変遷、AIに関する規制の変更等により、本契約条項のうち一部が想定外の評価を受ける可能性があることを理解し、その場合には信義則に</w:t>
       </w:r>
     </w:p>
     <w:p>
@@ -7971,7 +7987,7 @@
     <w:p>
       <w:pPr>
         <w:rPr>
-          <w:rFonts w:ascii="ヒラギノ明朝 ProN W3" w:eastAsia="ヒラギノ明朝 ProN W3" w:hAnsi="ヒラギノ明朝 ProN W3" w:hint="eastAsia"/>
+          <w:rFonts w:ascii="ヒラギノ明朝 ProN W3" w:eastAsia="ヒラギノ明朝 ProN W3" w:hAnsi="ヒラギノ明朝 ProN W3"/>
           <w:sz w:val="20"/>
           <w:szCs w:val="20"/>
         </w:rPr>

</xml_diff>

<commit_message>
Fix Payment Instruction Sheet
</commit_message>
<xml_diff>
--- a/1. AGREEMENT/1. General-Purpose Contract/1 Master Agreement for License of the Thought Formalization Procedure Right and the Complete Definition System.docx
+++ b/1. AGREEMENT/1. General-Purpose Contract/1 Master Agreement for License of the Thought Formalization Procedure Right and the Complete Definition System.docx
@@ -6978,7 +6978,7 @@
     <w:p>
       <w:pPr>
         <w:rPr>
-          <w:rFonts w:ascii="ヒラギノ明朝 ProN W3" w:eastAsia="ヒラギノ明朝 ProN W3" w:hAnsi="ヒラギノ明朝 ProN W3"/>
+          <w:rFonts w:ascii="ヒラギノ明朝 ProN W3" w:eastAsia="ヒラギノ明朝 ProN W3" w:hAnsi="ヒラギノ明朝 ProN W3" w:hint="eastAsia"/>
           <w:sz w:val="20"/>
           <w:szCs w:val="20"/>
         </w:rPr>
@@ -7039,13 +7039,23 @@
         </w:rPr>
         <w:t>（</w:t>
       </w:r>
-      <w:r>
-        <w:rPr>
-          <w:rFonts w:ascii="ヒラギノ明朝 ProN W3" w:eastAsia="ヒラギノ明朝 ProN W3" w:hAnsi="ヒラギノ明朝 ProN W3"/>
-          <w:sz w:val="20"/>
-          <w:szCs w:val="20"/>
-        </w:rPr>
-        <w:t>Payment Instruction Sheet）</w:t>
+      <w:bookmarkStart w:id="3" w:name="OLE_LINK1"/>
+      <w:r>
+        <w:rPr>
+          <w:rFonts w:ascii="ヒラギノ明朝 ProN W3" w:eastAsia="ヒラギノ明朝 ProN W3" w:hAnsi="ヒラギノ明朝 ProN W3"/>
+          <w:sz w:val="20"/>
+          <w:szCs w:val="20"/>
+        </w:rPr>
+        <w:t>Payment Instruction Sheet</w:t>
+      </w:r>
+      <w:bookmarkEnd w:id="3"/>
+      <w:r>
+        <w:rPr>
+          <w:rFonts w:ascii="ヒラギノ明朝 ProN W3" w:eastAsia="ヒラギノ明朝 ProN W3" w:hAnsi="ヒラギノ明朝 ProN W3"/>
+          <w:sz w:val="20"/>
+          <w:szCs w:val="20"/>
+        </w:rPr>
+        <w:t>）</w:t>
       </w:r>
     </w:p>
     <w:p>
@@ -7286,11 +7296,43 @@
       </w:r>
       <w:r>
         <w:rPr>
-          <w:rFonts w:ascii="ヒラギノ明朝 ProN W3" w:eastAsia="ヒラギノ明朝 ProN W3" w:hAnsi="ヒラギノ明朝 ProN W3"/>
-          <w:sz w:val="20"/>
-          <w:szCs w:val="20"/>
-        </w:rPr>
-        <w:t>Shohei KIMURA（キムラショウヘイ）</w:t>
+          <w:rFonts w:ascii="ヒラギノ明朝 ProN W3" w:eastAsia="ヒラギノ明朝 ProN W3" w:hAnsi="ヒラギノ明朝 ProN W3" w:hint="eastAsia"/>
+          <w:sz w:val="20"/>
+          <w:szCs w:val="20"/>
+        </w:rPr>
+        <w:t>キムラショウヘイ</w:t>
+      </w:r>
+      <w:r>
+        <w:rPr>
+          <w:rFonts w:ascii="ヒラギノ明朝 ProN W3" w:eastAsia="ヒラギノ明朝 ProN W3" w:hAnsi="ヒラギノ明朝 ProN W3"/>
+          <w:sz w:val="20"/>
+          <w:szCs w:val="20"/>
+        </w:rPr>
+        <w:t>（</w:t>
+      </w:r>
+      <w:r>
+        <w:rPr>
+          <w:rFonts w:ascii="ヒラギノ明朝 ProN W3" w:eastAsia="ヒラギノ明朝 ProN W3" w:hAnsi="ヒラギノ明朝 ProN W3" w:hint="eastAsia"/>
+          <w:sz w:val="20"/>
+          <w:szCs w:val="20"/>
+        </w:rPr>
+        <w:t>≒</w:t>
+      </w:r>
+      <w:r>
+        <w:rPr>
+          <w:rFonts w:ascii="ヒラギノ明朝 ProN W3" w:eastAsia="ヒラギノ明朝 ProN W3" w:hAnsi="ヒラギノ明朝 ProN W3"/>
+          <w:sz w:val="20"/>
+          <w:szCs w:val="20"/>
+        </w:rPr>
+        <w:t>Shohei KIMURA</w:t>
+      </w:r>
+      <w:r>
+        <w:rPr>
+          <w:rFonts w:ascii="ヒラギノ明朝 ProN W3" w:eastAsia="ヒラギノ明朝 ProN W3" w:hAnsi="ヒラギノ明朝 ProN W3"/>
+          <w:sz w:val="20"/>
+          <w:szCs w:val="20"/>
+        </w:rPr>
+        <w:t>）</w:t>
       </w:r>
     </w:p>
     <w:p>

</xml_diff>